<commit_message>
Agrega capturas de pantalla como evidencia en el reporte de incidencias
</commit_message>
<xml_diff>
--- a/docs/reports/Reporte_Incidencias_TouristMAR.docx
+++ b/docs/reports/Reporte_Incidencias_TouristMAR.docx
@@ -2541,7 +2541,7 @@
         <w:jc w:val="both"/>
       </w:pPr>
       <w:r>
-        <w:t xml:space="preserve">Cada incidencia se documenta con el mismo formato: descripción, pasos para reproducirla, resultado esperado, causa raíz, solución aplicada, archivos modificados y forma de verificación.</w:t>
+        <w:t xml:space="preserve">Cada incidencia se documenta con el mismo formato: descripción, pasos para reproducirla, resultado esperado, causa raíz, solución aplicada, archivos modificados y forma de verificación. Al inicio de cada ficha se incluyen, como ejemplo, las capturas de pantalla tomadas durante la revisión que muestran el problema antes de corregirlo.</w:t>
       </w:r>
     </w:p>
     <w:p>
@@ -2550,6 +2550,105 @@
       </w:pPr>
       <w:r>
         <w:t xml:space="preserve">3.1 INC-01 — La opción «¿Te gustaría registrar un lugar nuevo?» no realiza ninguna acción</w:t>
+      </w:r>
+    </w:p>
+    <w:tbl>
+      <w:tblPr>
+        <w:tblW w:type="dxa" w:w="3213"/>
+        <w:jc w:val="center"/>
+        <w:tblBorders>
+          <w:top w:val="single" w:color="auto" w:sz="4"/>
+          <w:left w:val="single" w:color="auto" w:sz="4"/>
+          <w:bottom w:val="single" w:color="auto" w:sz="4"/>
+          <w:right w:val="single" w:color="auto" w:sz="4"/>
+          <w:insideH w:val="single" w:color="auto" w:sz="4"/>
+          <w:insideV w:val="single" w:color="auto" w:sz="4"/>
+        </w:tblBorders>
+      </w:tblPr>
+      <w:tblGrid>
+        <w:gridCol w:w="3213"/>
+      </w:tblGrid>
+      <w:tr>
+        <w:tc>
+          <w:tcPr>
+            <w:tcW w:type="dxa" w:w="3213"/>
+            <w:tcBorders>
+              <w:top w:val="none" w:color="FFFFFF" w:sz="0"/>
+              <w:left w:val="none" w:color="FFFFFF" w:sz="0"/>
+              <w:bottom w:val="none" w:color="FFFFFF" w:sz="0"/>
+              <w:right w:val="none" w:color="FFFFFF" w:sz="0"/>
+            </w:tcBorders>
+          </w:tcPr>
+          <w:p>
+            <w:pPr>
+              <w:jc w:val="center"/>
+            </w:pPr>
+            <w:r>
+              <w:drawing>
+                <wp:inline distT="0" distB="0" distL="0" distR="0">
+                  <wp:extent cx="923925" cy="2047875"/>
+                  <wp:effectExtent t="0" r="0" b="0" l="0"/>
+                  <wp:docPr id="1" name="captura-1" descr="Pantalla de inicio con el banner «¿Te gustaría registrar un lugar nuevo?»." title="Captura INC-01"/>
+                  <wp:cNvGraphicFramePr>
+                    <a:graphicFrameLocks xmlns:a="http://schemas.openxmlformats.org/drawingml/2006/main" noChangeAspect="1"/>
+                  </wp:cNvGraphicFramePr>
+                  <a:graphic xmlns:a="http://schemas.openxmlformats.org/drawingml/2006/main">
+                    <a:graphicData uri="http://schemas.openxmlformats.org/drawingml/2006/picture">
+                      <pic:pic xmlns:pic="http://schemas.openxmlformats.org/drawingml/2006/picture">
+                        <pic:nvPicPr>
+                          <pic:cNvPr id="0" name="" descr=""/>
+                          <pic:cNvPicPr>
+                            <a:picLocks noChangeAspect="1" noChangeArrowheads="1"/>
+                          </pic:cNvPicPr>
+                        </pic:nvPicPr>
+                        <pic:blipFill>
+                          <a:blip r:embed="rId11" cstate="none"/>
+                          <a:srcRect/>
+                          <a:stretch>
+                            <a:fillRect/>
+                          </a:stretch>
+                        </pic:blipFill>
+                        <pic:spPr bwMode="auto">
+                          <a:xfrm>
+                            <a:off x="0" y="0"/>
+                            <a:ext cx="923925" cy="2047875"/>
+                          </a:xfrm>
+                          <a:prstGeom prst="rect">
+                            <a:avLst/>
+                          </a:prstGeom>
+                        </pic:spPr>
+                      </pic:pic>
+                    </a:graphicData>
+                  </a:graphic>
+                </wp:inline>
+              </w:drawing>
+            </w:r>
+          </w:p>
+        </w:tc>
+      </w:tr>
+    </w:tbl>
+    <w:p>
+      <w:pPr>
+        <w:spacing w:after="200" w:before="60"/>
+        <w:jc w:val="center"/>
+      </w:pPr>
+      <w:r>
+        <w:rPr>
+          <w:i/>
+          <w:iCs/>
+          <w:color w:val="5B6573"/>
+          <w:sz w:val="18"/>
+          <w:szCs w:val="18"/>
+        </w:rPr>
+        <w:t xml:space="preserve">Figura 1. Pantalla de inicio con el banner «¿Te gustaría registrar un lugar nuevo?». </w:t>
+      </w:r>
+      <w:r>
+        <w:rPr>
+          <w:color w:val="5B6573"/>
+          <w:sz w:val="17"/>
+          <w:szCs w:val="17"/>
+        </w:rPr>
+        <w:t xml:space="preserve">Captura tomada en un teléfono Android antes de la corrección.</w:t>
       </w:r>
     </w:p>
     <w:tbl>
@@ -3507,16 +3606,167 @@
     </w:tbl>
     <w:p>
       <w:pPr>
-        <w:spacing w:after="200"/>
-      </w:pPr>
-    </w:p>
-    <w:p>
-      <w:pPr>
         <w:pStyle w:val="Heading2"/>
         <w:pageBreakBefore/>
       </w:pPr>
       <w:r>
         <w:t xml:space="preserve">3.2 INC-02 — El teclado se despliega al abrir el menú lateral o las notificaciones</w:t>
+      </w:r>
+    </w:p>
+    <w:tbl>
+      <w:tblPr>
+        <w:tblW w:type="dxa" w:w="6426"/>
+        <w:jc w:val="center"/>
+        <w:tblBorders>
+          <w:top w:val="single" w:color="auto" w:sz="4"/>
+          <w:left w:val="single" w:color="auto" w:sz="4"/>
+          <w:bottom w:val="single" w:color="auto" w:sz="4"/>
+          <w:right w:val="single" w:color="auto" w:sz="4"/>
+          <w:insideH w:val="single" w:color="auto" w:sz="4"/>
+          <w:insideV w:val="single" w:color="auto" w:sz="4"/>
+        </w:tblBorders>
+      </w:tblPr>
+      <w:tblGrid>
+        <w:gridCol w:w="3213"/>
+        <w:gridCol w:w="3213"/>
+      </w:tblGrid>
+      <w:tr>
+        <w:tc>
+          <w:tcPr>
+            <w:tcW w:type="dxa" w:w="3213"/>
+            <w:tcBorders>
+              <w:top w:val="none" w:color="FFFFFF" w:sz="0"/>
+              <w:left w:val="none" w:color="FFFFFF" w:sz="0"/>
+              <w:bottom w:val="none" w:color="FFFFFF" w:sz="0"/>
+              <w:right w:val="none" w:color="FFFFFF" w:sz="0"/>
+            </w:tcBorders>
+          </w:tcPr>
+          <w:p>
+            <w:pPr>
+              <w:jc w:val="center"/>
+            </w:pPr>
+            <w:r>
+              <w:drawing>
+                <wp:inline distT="0" distB="0" distL="0" distR="0">
+                  <wp:extent cx="923925" cy="2047875"/>
+                  <wp:effectExtent t="0" r="0" b="0" l="0"/>
+                  <wp:docPr id="1" name="captura-2" descr="Teclado desplegado al abrir la pantalla de inicio y el menú lateral." title="Captura INC-02"/>
+                  <wp:cNvGraphicFramePr>
+                    <a:graphicFrameLocks xmlns:a="http://schemas.openxmlformats.org/drawingml/2006/main" noChangeAspect="1"/>
+                  </wp:cNvGraphicFramePr>
+                  <a:graphic xmlns:a="http://schemas.openxmlformats.org/drawingml/2006/main">
+                    <a:graphicData uri="http://schemas.openxmlformats.org/drawingml/2006/picture">
+                      <pic:pic xmlns:pic="http://schemas.openxmlformats.org/drawingml/2006/picture">
+                        <pic:nvPicPr>
+                          <pic:cNvPr id="0" name="" descr=""/>
+                          <pic:cNvPicPr>
+                            <a:picLocks noChangeAspect="1" noChangeArrowheads="1"/>
+                          </pic:cNvPicPr>
+                        </pic:nvPicPr>
+                        <pic:blipFill>
+                          <a:blip r:embed="rId12" cstate="none"/>
+                          <a:srcRect/>
+                          <a:stretch>
+                            <a:fillRect/>
+                          </a:stretch>
+                        </pic:blipFill>
+                        <pic:spPr bwMode="auto">
+                          <a:xfrm>
+                            <a:off x="0" y="0"/>
+                            <a:ext cx="923925" cy="2047875"/>
+                          </a:xfrm>
+                          <a:prstGeom prst="rect">
+                            <a:avLst/>
+                          </a:prstGeom>
+                        </pic:spPr>
+                      </pic:pic>
+                    </a:graphicData>
+                  </a:graphic>
+                </wp:inline>
+              </w:drawing>
+            </w:r>
+          </w:p>
+        </w:tc>
+        <w:tc>
+          <w:tcPr>
+            <w:tcW w:type="dxa" w:w="3213"/>
+            <w:tcBorders>
+              <w:top w:val="none" w:color="FFFFFF" w:sz="0"/>
+              <w:left w:val="none" w:color="FFFFFF" w:sz="0"/>
+              <w:bottom w:val="none" w:color="FFFFFF" w:sz="0"/>
+              <w:right w:val="none" w:color="FFFFFF" w:sz="0"/>
+            </w:tcBorders>
+          </w:tcPr>
+          <w:p>
+            <w:pPr>
+              <w:jc w:val="center"/>
+            </w:pPr>
+            <w:r>
+              <w:drawing>
+                <wp:inline distT="0" distB="0" distL="0" distR="0">
+                  <wp:extent cx="923925" cy="2047875"/>
+                  <wp:effectExtent t="0" r="0" b="0" l="0"/>
+                  <wp:docPr id="1" name="captura-3" descr="Teclado desplegado al abrir la pantalla de inicio y el menú lateral." title="Captura INC-02"/>
+                  <wp:cNvGraphicFramePr>
+                    <a:graphicFrameLocks xmlns:a="http://schemas.openxmlformats.org/drawingml/2006/main" noChangeAspect="1"/>
+                  </wp:cNvGraphicFramePr>
+                  <a:graphic xmlns:a="http://schemas.openxmlformats.org/drawingml/2006/main">
+                    <a:graphicData uri="http://schemas.openxmlformats.org/drawingml/2006/picture">
+                      <pic:pic xmlns:pic="http://schemas.openxmlformats.org/drawingml/2006/picture">
+                        <pic:nvPicPr>
+                          <pic:cNvPr id="0" name="" descr=""/>
+                          <pic:cNvPicPr>
+                            <a:picLocks noChangeAspect="1" noChangeArrowheads="1"/>
+                          </pic:cNvPicPr>
+                        </pic:nvPicPr>
+                        <pic:blipFill>
+                          <a:blip r:embed="rId13" cstate="none"/>
+                          <a:srcRect/>
+                          <a:stretch>
+                            <a:fillRect/>
+                          </a:stretch>
+                        </pic:blipFill>
+                        <pic:spPr bwMode="auto">
+                          <a:xfrm>
+                            <a:off x="0" y="0"/>
+                            <a:ext cx="923925" cy="2047875"/>
+                          </a:xfrm>
+                          <a:prstGeom prst="rect">
+                            <a:avLst/>
+                          </a:prstGeom>
+                        </pic:spPr>
+                      </pic:pic>
+                    </a:graphicData>
+                  </a:graphic>
+                </wp:inline>
+              </w:drawing>
+            </w:r>
+          </w:p>
+        </w:tc>
+      </w:tr>
+    </w:tbl>
+    <w:p>
+      <w:pPr>
+        <w:spacing w:after="200" w:before="60"/>
+        <w:jc w:val="center"/>
+      </w:pPr>
+      <w:r>
+        <w:rPr>
+          <w:i/>
+          <w:iCs/>
+          <w:color w:val="5B6573"/>
+          <w:sz w:val="18"/>
+          <w:szCs w:val="18"/>
+        </w:rPr>
+        <w:t xml:space="preserve">Figura 2. Teclado desplegado al abrir la pantalla de inicio y el menú lateral. </w:t>
+      </w:r>
+      <w:r>
+        <w:rPr>
+          <w:color w:val="5B6573"/>
+          <w:sz w:val="17"/>
+          <w:szCs w:val="17"/>
+        </w:rPr>
+        <w:t xml:space="preserve">Captura tomada en un teléfono Android antes de la corrección.</w:t>
       </w:r>
     </w:p>
     <w:tbl>
@@ -4546,16 +4796,110 @@
     </w:tbl>
     <w:p>
       <w:pPr>
-        <w:spacing w:after="200"/>
-      </w:pPr>
-    </w:p>
-    <w:p>
-      <w:pPr>
         <w:pStyle w:val="Heading2"/>
         <w:pageBreakBefore/>
       </w:pPr>
       <w:r>
         <w:t xml:space="preserve">3.3 INC-03 — La barra de estado del teléfono se superpone con la barra superior de la app</w:t>
+      </w:r>
+    </w:p>
+    <w:tbl>
+      <w:tblPr>
+        <w:tblW w:type="dxa" w:w="3213"/>
+        <w:jc w:val="center"/>
+        <w:tblBorders>
+          <w:top w:val="single" w:color="auto" w:sz="4"/>
+          <w:left w:val="single" w:color="auto" w:sz="4"/>
+          <w:bottom w:val="single" w:color="auto" w:sz="4"/>
+          <w:right w:val="single" w:color="auto" w:sz="4"/>
+          <w:insideH w:val="single" w:color="auto" w:sz="4"/>
+          <w:insideV w:val="single" w:color="auto" w:sz="4"/>
+        </w:tblBorders>
+      </w:tblPr>
+      <w:tblGrid>
+        <w:gridCol w:w="3213"/>
+      </w:tblGrid>
+      <w:tr>
+        <w:tc>
+          <w:tcPr>
+            <w:tcW w:type="dxa" w:w="3213"/>
+            <w:tcBorders>
+              <w:top w:val="none" w:color="FFFFFF" w:sz="0"/>
+              <w:left w:val="none" w:color="FFFFFF" w:sz="0"/>
+              <w:bottom w:val="none" w:color="FFFFFF" w:sz="0"/>
+              <w:right w:val="none" w:color="FFFFFF" w:sz="0"/>
+            </w:tcBorders>
+          </w:tcPr>
+          <w:p>
+            <w:pPr>
+              <w:jc w:val="center"/>
+            </w:pPr>
+            <w:r>
+              <w:drawing>
+                <wp:inline distT="0" distB="0" distL="0" distR="0">
+                  <wp:extent cx="923925" cy="2047875"/>
+                  <wp:effectExtent t="0" r="0" b="0" l="0"/>
+                  <wp:docPr id="1" name="captura-4" descr="La barra de estado del teléfono se encima con la barra superior de la app." title="Captura INC-03"/>
+                  <wp:cNvGraphicFramePr>
+                    <a:graphicFrameLocks xmlns:a="http://schemas.openxmlformats.org/drawingml/2006/main" noChangeAspect="1"/>
+                  </wp:cNvGraphicFramePr>
+                  <a:graphic xmlns:a="http://schemas.openxmlformats.org/drawingml/2006/main">
+                    <a:graphicData uri="http://schemas.openxmlformats.org/drawingml/2006/picture">
+                      <pic:pic xmlns:pic="http://schemas.openxmlformats.org/drawingml/2006/picture">
+                        <pic:nvPicPr>
+                          <pic:cNvPr id="0" name="" descr=""/>
+                          <pic:cNvPicPr>
+                            <a:picLocks noChangeAspect="1" noChangeArrowheads="1"/>
+                          </pic:cNvPicPr>
+                        </pic:nvPicPr>
+                        <pic:blipFill>
+                          <a:blip r:embed="rId14" cstate="none"/>
+                          <a:srcRect/>
+                          <a:stretch>
+                            <a:fillRect/>
+                          </a:stretch>
+                        </pic:blipFill>
+                        <pic:spPr bwMode="auto">
+                          <a:xfrm>
+                            <a:off x="0" y="0"/>
+                            <a:ext cx="923925" cy="2047875"/>
+                          </a:xfrm>
+                          <a:prstGeom prst="rect">
+                            <a:avLst/>
+                          </a:prstGeom>
+                        </pic:spPr>
+                      </pic:pic>
+                    </a:graphicData>
+                  </a:graphic>
+                </wp:inline>
+              </w:drawing>
+            </w:r>
+          </w:p>
+        </w:tc>
+      </w:tr>
+    </w:tbl>
+    <w:p>
+      <w:pPr>
+        <w:spacing w:after="200" w:before="60"/>
+        <w:jc w:val="center"/>
+      </w:pPr>
+      <w:r>
+        <w:rPr>
+          <w:i/>
+          <w:iCs/>
+          <w:color w:val="5B6573"/>
+          <w:sz w:val="18"/>
+          <w:szCs w:val="18"/>
+        </w:rPr>
+        <w:t xml:space="preserve">Figura 3. La barra de estado del teléfono se encima con la barra superior de la app. </w:t>
+      </w:r>
+      <w:r>
+        <w:rPr>
+          <w:color w:val="5B6573"/>
+          <w:sz w:val="17"/>
+          <w:szCs w:val="17"/>
+        </w:rPr>
+        <w:t xml:space="preserve">Captura tomada en un teléfono Android antes de la corrección.</w:t>
       </w:r>
     </w:p>
     <w:tbl>
@@ -5447,16 +5791,167 @@
     </w:tbl>
     <w:p>
       <w:pPr>
-        <w:spacing w:after="200"/>
-      </w:pPr>
-    </w:p>
-    <w:p>
-      <w:pPr>
         <w:pStyle w:val="Heading2"/>
         <w:pageBreakBefore/>
       </w:pPr>
       <w:r>
         <w:t xml:space="preserve">3.4 INC-04 — La foto de perfil cancelada reaparece al volver a «Editar perfil»</w:t>
+      </w:r>
+    </w:p>
+    <w:tbl>
+      <w:tblPr>
+        <w:tblW w:type="dxa" w:w="6426"/>
+        <w:jc w:val="center"/>
+        <w:tblBorders>
+          <w:top w:val="single" w:color="auto" w:sz="4"/>
+          <w:left w:val="single" w:color="auto" w:sz="4"/>
+          <w:bottom w:val="single" w:color="auto" w:sz="4"/>
+          <w:right w:val="single" w:color="auto" w:sz="4"/>
+          <w:insideH w:val="single" w:color="auto" w:sz="4"/>
+          <w:insideV w:val="single" w:color="auto" w:sz="4"/>
+        </w:tblBorders>
+      </w:tblPr>
+      <w:tblGrid>
+        <w:gridCol w:w="3213"/>
+        <w:gridCol w:w="3213"/>
+      </w:tblGrid>
+      <w:tr>
+        <w:tc>
+          <w:tcPr>
+            <w:tcW w:type="dxa" w:w="3213"/>
+            <w:tcBorders>
+              <w:top w:val="none" w:color="FFFFFF" w:sz="0"/>
+              <w:left w:val="none" w:color="FFFFFF" w:sz="0"/>
+              <w:bottom w:val="none" w:color="FFFFFF" w:sz="0"/>
+              <w:right w:val="none" w:color="FFFFFF" w:sz="0"/>
+            </w:tcBorders>
+          </w:tcPr>
+          <w:p>
+            <w:pPr>
+              <w:jc w:val="center"/>
+            </w:pPr>
+            <w:r>
+              <w:drawing>
+                <wp:inline distT="0" distB="0" distL="0" distR="0">
+                  <wp:extent cx="923925" cy="2047875"/>
+                  <wp:effectExtent t="0" r="0" b="0" l="0"/>
+                  <wp:docPr id="1" name="captura-5" descr="Pantalla «Editar perfil» con la foto seleccionada y perfil después de cancelar." title="Captura INC-04"/>
+                  <wp:cNvGraphicFramePr>
+                    <a:graphicFrameLocks xmlns:a="http://schemas.openxmlformats.org/drawingml/2006/main" noChangeAspect="1"/>
+                  </wp:cNvGraphicFramePr>
+                  <a:graphic xmlns:a="http://schemas.openxmlformats.org/drawingml/2006/main">
+                    <a:graphicData uri="http://schemas.openxmlformats.org/drawingml/2006/picture">
+                      <pic:pic xmlns:pic="http://schemas.openxmlformats.org/drawingml/2006/picture">
+                        <pic:nvPicPr>
+                          <pic:cNvPr id="0" name="" descr=""/>
+                          <pic:cNvPicPr>
+                            <a:picLocks noChangeAspect="1" noChangeArrowheads="1"/>
+                          </pic:cNvPicPr>
+                        </pic:nvPicPr>
+                        <pic:blipFill>
+                          <a:blip r:embed="rId15" cstate="none"/>
+                          <a:srcRect/>
+                          <a:stretch>
+                            <a:fillRect/>
+                          </a:stretch>
+                        </pic:blipFill>
+                        <pic:spPr bwMode="auto">
+                          <a:xfrm>
+                            <a:off x="0" y="0"/>
+                            <a:ext cx="923925" cy="2047875"/>
+                          </a:xfrm>
+                          <a:prstGeom prst="rect">
+                            <a:avLst/>
+                          </a:prstGeom>
+                        </pic:spPr>
+                      </pic:pic>
+                    </a:graphicData>
+                  </a:graphic>
+                </wp:inline>
+              </w:drawing>
+            </w:r>
+          </w:p>
+        </w:tc>
+        <w:tc>
+          <w:tcPr>
+            <w:tcW w:type="dxa" w:w="3213"/>
+            <w:tcBorders>
+              <w:top w:val="none" w:color="FFFFFF" w:sz="0"/>
+              <w:left w:val="none" w:color="FFFFFF" w:sz="0"/>
+              <w:bottom w:val="none" w:color="FFFFFF" w:sz="0"/>
+              <w:right w:val="none" w:color="FFFFFF" w:sz="0"/>
+            </w:tcBorders>
+          </w:tcPr>
+          <w:p>
+            <w:pPr>
+              <w:jc w:val="center"/>
+            </w:pPr>
+            <w:r>
+              <w:drawing>
+                <wp:inline distT="0" distB="0" distL="0" distR="0">
+                  <wp:extent cx="923925" cy="2047875"/>
+                  <wp:effectExtent t="0" r="0" b="0" l="0"/>
+                  <wp:docPr id="1" name="captura-6" descr="Pantalla «Editar perfil» con la foto seleccionada y perfil después de cancelar." title="Captura INC-04"/>
+                  <wp:cNvGraphicFramePr>
+                    <a:graphicFrameLocks xmlns:a="http://schemas.openxmlformats.org/drawingml/2006/main" noChangeAspect="1"/>
+                  </wp:cNvGraphicFramePr>
+                  <a:graphic xmlns:a="http://schemas.openxmlformats.org/drawingml/2006/main">
+                    <a:graphicData uri="http://schemas.openxmlformats.org/drawingml/2006/picture">
+                      <pic:pic xmlns:pic="http://schemas.openxmlformats.org/drawingml/2006/picture">
+                        <pic:nvPicPr>
+                          <pic:cNvPr id="0" name="" descr=""/>
+                          <pic:cNvPicPr>
+                            <a:picLocks noChangeAspect="1" noChangeArrowheads="1"/>
+                          </pic:cNvPicPr>
+                        </pic:nvPicPr>
+                        <pic:blipFill>
+                          <a:blip r:embed="rId16" cstate="none"/>
+                          <a:srcRect/>
+                          <a:stretch>
+                            <a:fillRect/>
+                          </a:stretch>
+                        </pic:blipFill>
+                        <pic:spPr bwMode="auto">
+                          <a:xfrm>
+                            <a:off x="0" y="0"/>
+                            <a:ext cx="923925" cy="2047875"/>
+                          </a:xfrm>
+                          <a:prstGeom prst="rect">
+                            <a:avLst/>
+                          </a:prstGeom>
+                        </pic:spPr>
+                      </pic:pic>
+                    </a:graphicData>
+                  </a:graphic>
+                </wp:inline>
+              </w:drawing>
+            </w:r>
+          </w:p>
+        </w:tc>
+      </w:tr>
+    </w:tbl>
+    <w:p>
+      <w:pPr>
+        <w:spacing w:after="200" w:before="60"/>
+        <w:jc w:val="center"/>
+      </w:pPr>
+      <w:r>
+        <w:rPr>
+          <w:i/>
+          <w:iCs/>
+          <w:color w:val="5B6573"/>
+          <w:sz w:val="18"/>
+          <w:szCs w:val="18"/>
+        </w:rPr>
+        <w:t xml:space="preserve">Figura 4. Pantalla «Editar perfil» con la foto seleccionada y perfil después de cancelar. </w:t>
+      </w:r>
+      <w:r>
+        <w:rPr>
+          <w:color w:val="5B6573"/>
+          <w:sz w:val="17"/>
+          <w:szCs w:val="17"/>
+        </w:rPr>
+        <w:t xml:space="preserve">Captura tomada en un teléfono Android antes de la corrección.</w:t>
       </w:r>
     </w:p>
     <w:tbl>
@@ -6361,16 +6856,110 @@
     </w:tbl>
     <w:p>
       <w:pPr>
-        <w:spacing w:after="200"/>
-      </w:pPr>
-    </w:p>
-    <w:p>
-      <w:pPr>
         <w:pStyle w:val="Heading2"/>
         <w:pageBreakBefore/>
       </w:pPr>
       <w:r>
         <w:t xml:space="preserve">3.5 INC-05 — Cambiar entre modo claro y oscuro aplica la foto de perfil no guardada</w:t>
+      </w:r>
+    </w:p>
+    <w:tbl>
+      <w:tblPr>
+        <w:tblW w:type="dxa" w:w="3213"/>
+        <w:jc w:val="center"/>
+        <w:tblBorders>
+          <w:top w:val="single" w:color="auto" w:sz="4"/>
+          <w:left w:val="single" w:color="auto" w:sz="4"/>
+          <w:bottom w:val="single" w:color="auto" w:sz="4"/>
+          <w:right w:val="single" w:color="auto" w:sz="4"/>
+          <w:insideH w:val="single" w:color="auto" w:sz="4"/>
+          <w:insideV w:val="single" w:color="auto" w:sz="4"/>
+        </w:tblBorders>
+      </w:tblPr>
+      <w:tblGrid>
+        <w:gridCol w:w="3213"/>
+      </w:tblGrid>
+      <w:tr>
+        <w:tc>
+          <w:tcPr>
+            <w:tcW w:type="dxa" w:w="3213"/>
+            <w:tcBorders>
+              <w:top w:val="none" w:color="FFFFFF" w:sz="0"/>
+              <w:left w:val="none" w:color="FFFFFF" w:sz="0"/>
+              <w:bottom w:val="none" w:color="FFFFFF" w:sz="0"/>
+              <w:right w:val="none" w:color="FFFFFF" w:sz="0"/>
+            </w:tcBorders>
+          </w:tcPr>
+          <w:p>
+            <w:pPr>
+              <w:jc w:val="center"/>
+            </w:pPr>
+            <w:r>
+              <w:drawing>
+                <wp:inline distT="0" distB="0" distL="0" distR="0">
+                  <wp:extent cx="923925" cy="2047875"/>
+                  <wp:effectExtent t="0" r="0" b="0" l="0"/>
+                  <wp:docPr id="1" name="captura-7" descr="Foto no guardada aplicada al perfil después de cambiar de tema." title="Captura INC-05"/>
+                  <wp:cNvGraphicFramePr>
+                    <a:graphicFrameLocks xmlns:a="http://schemas.openxmlformats.org/drawingml/2006/main" noChangeAspect="1"/>
+                  </wp:cNvGraphicFramePr>
+                  <a:graphic xmlns:a="http://schemas.openxmlformats.org/drawingml/2006/main">
+                    <a:graphicData uri="http://schemas.openxmlformats.org/drawingml/2006/picture">
+                      <pic:pic xmlns:pic="http://schemas.openxmlformats.org/drawingml/2006/picture">
+                        <pic:nvPicPr>
+                          <pic:cNvPr id="0" name="" descr=""/>
+                          <pic:cNvPicPr>
+                            <a:picLocks noChangeAspect="1" noChangeArrowheads="1"/>
+                          </pic:cNvPicPr>
+                        </pic:nvPicPr>
+                        <pic:blipFill>
+                          <a:blip r:embed="rId17" cstate="none"/>
+                          <a:srcRect/>
+                          <a:stretch>
+                            <a:fillRect/>
+                          </a:stretch>
+                        </pic:blipFill>
+                        <pic:spPr bwMode="auto">
+                          <a:xfrm>
+                            <a:off x="0" y="0"/>
+                            <a:ext cx="923925" cy="2047875"/>
+                          </a:xfrm>
+                          <a:prstGeom prst="rect">
+                            <a:avLst/>
+                          </a:prstGeom>
+                        </pic:spPr>
+                      </pic:pic>
+                    </a:graphicData>
+                  </a:graphic>
+                </wp:inline>
+              </w:drawing>
+            </w:r>
+          </w:p>
+        </w:tc>
+      </w:tr>
+    </w:tbl>
+    <w:p>
+      <w:pPr>
+        <w:spacing w:after="200" w:before="60"/>
+        <w:jc w:val="center"/>
+      </w:pPr>
+      <w:r>
+        <w:rPr>
+          <w:i/>
+          <w:iCs/>
+          <w:color w:val="5B6573"/>
+          <w:sz w:val="18"/>
+          <w:szCs w:val="18"/>
+        </w:rPr>
+        <w:t xml:space="preserve">Figura 5. Foto no guardada aplicada al perfil después de cambiar de tema. </w:t>
+      </w:r>
+      <w:r>
+        <w:rPr>
+          <w:color w:val="5B6573"/>
+          <w:sz w:val="17"/>
+          <w:szCs w:val="17"/>
+        </w:rPr>
+        <w:t xml:space="preserve">Captura tomada en un teléfono Android antes de la corrección.</w:t>
       </w:r>
     </w:p>
     <w:tbl>
@@ -7187,16 +7776,224 @@
     </w:tbl>
     <w:p>
       <w:pPr>
-        <w:spacing w:after="200"/>
-      </w:pPr>
-    </w:p>
-    <w:p>
-      <w:pPr>
         <w:pStyle w:val="Heading2"/>
         <w:pageBreakBefore/>
       </w:pPr>
       <w:r>
         <w:t xml:space="preserve">3.6 INC-06 — La foto no guardada aparece al reabrir el perfil o la app</w:t>
+      </w:r>
+    </w:p>
+    <w:tbl>
+      <w:tblPr>
+        <w:tblW w:type="dxa" w:w="9639"/>
+        <w:jc w:val="center"/>
+        <w:tblBorders>
+          <w:top w:val="single" w:color="auto" w:sz="4"/>
+          <w:left w:val="single" w:color="auto" w:sz="4"/>
+          <w:bottom w:val="single" w:color="auto" w:sz="4"/>
+          <w:right w:val="single" w:color="auto" w:sz="4"/>
+          <w:insideH w:val="single" w:color="auto" w:sz="4"/>
+          <w:insideV w:val="single" w:color="auto" w:sz="4"/>
+        </w:tblBorders>
+      </w:tblPr>
+      <w:tblGrid>
+        <w:gridCol w:w="3213"/>
+        <w:gridCol w:w="3213"/>
+        <w:gridCol w:w="3213"/>
+      </w:tblGrid>
+      <w:tr>
+        <w:tc>
+          <w:tcPr>
+            <w:tcW w:type="dxa" w:w="3213"/>
+            <w:tcBorders>
+              <w:top w:val="none" w:color="FFFFFF" w:sz="0"/>
+              <w:left w:val="none" w:color="FFFFFF" w:sz="0"/>
+              <w:bottom w:val="none" w:color="FFFFFF" w:sz="0"/>
+              <w:right w:val="none" w:color="FFFFFF" w:sz="0"/>
+            </w:tcBorders>
+          </w:tcPr>
+          <w:p>
+            <w:pPr>
+              <w:jc w:val="center"/>
+            </w:pPr>
+            <w:r>
+              <w:drawing>
+                <wp:inline distT="0" distB="0" distL="0" distR="0">
+                  <wp:extent cx="923925" cy="2047875"/>
+                  <wp:effectExtent t="0" r="0" b="0" l="0"/>
+                  <wp:docPr id="1" name="captura-9" descr="La foto no guardada aparece al volver a entrar al perfil." title="Captura INC-06"/>
+                  <wp:cNvGraphicFramePr>
+                    <a:graphicFrameLocks xmlns:a="http://schemas.openxmlformats.org/drawingml/2006/main" noChangeAspect="1"/>
+                  </wp:cNvGraphicFramePr>
+                  <a:graphic xmlns:a="http://schemas.openxmlformats.org/drawingml/2006/main">
+                    <a:graphicData uri="http://schemas.openxmlformats.org/drawingml/2006/picture">
+                      <pic:pic xmlns:pic="http://schemas.openxmlformats.org/drawingml/2006/picture">
+                        <pic:nvPicPr>
+                          <pic:cNvPr id="0" name="" descr=""/>
+                          <pic:cNvPicPr>
+                            <a:picLocks noChangeAspect="1" noChangeArrowheads="1"/>
+                          </pic:cNvPicPr>
+                        </pic:nvPicPr>
+                        <pic:blipFill>
+                          <a:blip r:embed="rId18" cstate="none"/>
+                          <a:srcRect/>
+                          <a:stretch>
+                            <a:fillRect/>
+                          </a:stretch>
+                        </pic:blipFill>
+                        <pic:spPr bwMode="auto">
+                          <a:xfrm>
+                            <a:off x="0" y="0"/>
+                            <a:ext cx="923925" cy="2047875"/>
+                          </a:xfrm>
+                          <a:prstGeom prst="rect">
+                            <a:avLst/>
+                          </a:prstGeom>
+                        </pic:spPr>
+                      </pic:pic>
+                    </a:graphicData>
+                  </a:graphic>
+                </wp:inline>
+              </w:drawing>
+            </w:r>
+          </w:p>
+        </w:tc>
+        <w:tc>
+          <w:tcPr>
+            <w:tcW w:type="dxa" w:w="3213"/>
+            <w:tcBorders>
+              <w:top w:val="none" w:color="FFFFFF" w:sz="0"/>
+              <w:left w:val="none" w:color="FFFFFF" w:sz="0"/>
+              <w:bottom w:val="none" w:color="FFFFFF" w:sz="0"/>
+              <w:right w:val="none" w:color="FFFFFF" w:sz="0"/>
+            </w:tcBorders>
+          </w:tcPr>
+          <w:p>
+            <w:pPr>
+              <w:jc w:val="center"/>
+            </w:pPr>
+            <w:r>
+              <w:drawing>
+                <wp:inline distT="0" distB="0" distL="0" distR="0">
+                  <wp:extent cx="923925" cy="2047875"/>
+                  <wp:effectExtent t="0" r="0" b="0" l="0"/>
+                  <wp:docPr id="1" name="captura-10" descr="La foto no guardada aparece al volver a entrar al perfil." title="Captura INC-06"/>
+                  <wp:cNvGraphicFramePr>
+                    <a:graphicFrameLocks xmlns:a="http://schemas.openxmlformats.org/drawingml/2006/main" noChangeAspect="1"/>
+                  </wp:cNvGraphicFramePr>
+                  <a:graphic xmlns:a="http://schemas.openxmlformats.org/drawingml/2006/main">
+                    <a:graphicData uri="http://schemas.openxmlformats.org/drawingml/2006/picture">
+                      <pic:pic xmlns:pic="http://schemas.openxmlformats.org/drawingml/2006/picture">
+                        <pic:nvPicPr>
+                          <pic:cNvPr id="0" name="" descr=""/>
+                          <pic:cNvPicPr>
+                            <a:picLocks noChangeAspect="1" noChangeArrowheads="1"/>
+                          </pic:cNvPicPr>
+                        </pic:nvPicPr>
+                        <pic:blipFill>
+                          <a:blip r:embed="rId19" cstate="none"/>
+                          <a:srcRect/>
+                          <a:stretch>
+                            <a:fillRect/>
+                          </a:stretch>
+                        </pic:blipFill>
+                        <pic:spPr bwMode="auto">
+                          <a:xfrm>
+                            <a:off x="0" y="0"/>
+                            <a:ext cx="923925" cy="2047875"/>
+                          </a:xfrm>
+                          <a:prstGeom prst="rect">
+                            <a:avLst/>
+                          </a:prstGeom>
+                        </pic:spPr>
+                      </pic:pic>
+                    </a:graphicData>
+                  </a:graphic>
+                </wp:inline>
+              </w:drawing>
+            </w:r>
+          </w:p>
+        </w:tc>
+        <w:tc>
+          <w:tcPr>
+            <w:tcW w:type="dxa" w:w="3213"/>
+            <w:tcBorders>
+              <w:top w:val="none" w:color="FFFFFF" w:sz="0"/>
+              <w:left w:val="none" w:color="FFFFFF" w:sz="0"/>
+              <w:bottom w:val="none" w:color="FFFFFF" w:sz="0"/>
+              <w:right w:val="none" w:color="FFFFFF" w:sz="0"/>
+            </w:tcBorders>
+          </w:tcPr>
+          <w:p>
+            <w:pPr>
+              <w:jc w:val="center"/>
+            </w:pPr>
+            <w:r>
+              <w:drawing>
+                <wp:inline distT="0" distB="0" distL="0" distR="0">
+                  <wp:extent cx="923925" cy="2047875"/>
+                  <wp:effectExtent t="0" r="0" b="0" l="0"/>
+                  <wp:docPr id="1" name="captura-11" descr="La foto no guardada aparece al volver a entrar al perfil." title="Captura INC-06"/>
+                  <wp:cNvGraphicFramePr>
+                    <a:graphicFrameLocks xmlns:a="http://schemas.openxmlformats.org/drawingml/2006/main" noChangeAspect="1"/>
+                  </wp:cNvGraphicFramePr>
+                  <a:graphic xmlns:a="http://schemas.openxmlformats.org/drawingml/2006/main">
+                    <a:graphicData uri="http://schemas.openxmlformats.org/drawingml/2006/picture">
+                      <pic:pic xmlns:pic="http://schemas.openxmlformats.org/drawingml/2006/picture">
+                        <pic:nvPicPr>
+                          <pic:cNvPr id="0" name="" descr=""/>
+                          <pic:cNvPicPr>
+                            <a:picLocks noChangeAspect="1" noChangeArrowheads="1"/>
+                          </pic:cNvPicPr>
+                        </pic:nvPicPr>
+                        <pic:blipFill>
+                          <a:blip r:embed="rId20" cstate="none"/>
+                          <a:srcRect/>
+                          <a:stretch>
+                            <a:fillRect/>
+                          </a:stretch>
+                        </pic:blipFill>
+                        <pic:spPr bwMode="auto">
+                          <a:xfrm>
+                            <a:off x="0" y="0"/>
+                            <a:ext cx="923925" cy="2047875"/>
+                          </a:xfrm>
+                          <a:prstGeom prst="rect">
+                            <a:avLst/>
+                          </a:prstGeom>
+                        </pic:spPr>
+                      </pic:pic>
+                    </a:graphicData>
+                  </a:graphic>
+                </wp:inline>
+              </w:drawing>
+            </w:r>
+          </w:p>
+        </w:tc>
+      </w:tr>
+    </w:tbl>
+    <w:p>
+      <w:pPr>
+        <w:spacing w:after="200" w:before="60"/>
+        <w:jc w:val="center"/>
+      </w:pPr>
+      <w:r>
+        <w:rPr>
+          <w:i/>
+          <w:iCs/>
+          <w:color w:val="5B6573"/>
+          <w:sz w:val="18"/>
+          <w:szCs w:val="18"/>
+        </w:rPr>
+        <w:t xml:space="preserve">Figura 6. La foto no guardada aparece al volver a entrar al perfil. </w:t>
+      </w:r>
+      <w:r>
+        <w:rPr>
+          <w:color w:val="5B6573"/>
+          <w:sz w:val="17"/>
+          <w:szCs w:val="17"/>
+        </w:rPr>
+        <w:t xml:space="preserve">Captura tomada en un teléfono Android antes de la corrección.</w:t>
       </w:r>
     </w:p>
     <w:tbl>
@@ -8001,16 +8798,224 @@
     </w:tbl>
     <w:p>
       <w:pPr>
-        <w:spacing w:after="200"/>
-      </w:pPr>
-    </w:p>
-    <w:p>
-      <w:pPr>
         <w:pStyle w:val="Heading2"/>
         <w:pageBreakBefore/>
       </w:pPr>
       <w:r>
         <w:t xml:space="preserve">3.7 INC-07 — La foto de portada no guardada se aplica en el modo empresario</w:t>
+      </w:r>
+    </w:p>
+    <w:tbl>
+      <w:tblPr>
+        <w:tblW w:type="dxa" w:w="9639"/>
+        <w:jc w:val="center"/>
+        <w:tblBorders>
+          <w:top w:val="single" w:color="auto" w:sz="4"/>
+          <w:left w:val="single" w:color="auto" w:sz="4"/>
+          <w:bottom w:val="single" w:color="auto" w:sz="4"/>
+          <w:right w:val="single" w:color="auto" w:sz="4"/>
+          <w:insideH w:val="single" w:color="auto" w:sz="4"/>
+          <w:insideV w:val="single" w:color="auto" w:sz="4"/>
+        </w:tblBorders>
+      </w:tblPr>
+      <w:tblGrid>
+        <w:gridCol w:w="3213"/>
+        <w:gridCol w:w="3213"/>
+        <w:gridCol w:w="3213"/>
+      </w:tblGrid>
+      <w:tr>
+        <w:tc>
+          <w:tcPr>
+            <w:tcW w:type="dxa" w:w="3213"/>
+            <w:tcBorders>
+              <w:top w:val="none" w:color="FFFFFF" w:sz="0"/>
+              <w:left w:val="none" w:color="FFFFFF" w:sz="0"/>
+              <w:bottom w:val="none" w:color="FFFFFF" w:sz="0"/>
+              <w:right w:val="none" w:color="FFFFFF" w:sz="0"/>
+            </w:tcBorders>
+          </w:tcPr>
+          <w:p>
+            <w:pPr>
+              <w:jc w:val="center"/>
+            </w:pPr>
+            <w:r>
+              <w:drawing>
+                <wp:inline distT="0" distB="0" distL="0" distR="0">
+                  <wp:extent cx="923925" cy="2047875"/>
+                  <wp:effectExtent t="0" r="0" b="0" l="0"/>
+                  <wp:docPr id="1" name="captura-12" descr="Panel de empresa: edición de la portada del negocio sin guardar." title="Captura INC-07"/>
+                  <wp:cNvGraphicFramePr>
+                    <a:graphicFrameLocks xmlns:a="http://schemas.openxmlformats.org/drawingml/2006/main" noChangeAspect="1"/>
+                  </wp:cNvGraphicFramePr>
+                  <a:graphic xmlns:a="http://schemas.openxmlformats.org/drawingml/2006/main">
+                    <a:graphicData uri="http://schemas.openxmlformats.org/drawingml/2006/picture">
+                      <pic:pic xmlns:pic="http://schemas.openxmlformats.org/drawingml/2006/picture">
+                        <pic:nvPicPr>
+                          <pic:cNvPr id="0" name="" descr=""/>
+                          <pic:cNvPicPr>
+                            <a:picLocks noChangeAspect="1" noChangeArrowheads="1"/>
+                          </pic:cNvPicPr>
+                        </pic:nvPicPr>
+                        <pic:blipFill>
+                          <a:blip r:embed="rId21" cstate="none"/>
+                          <a:srcRect/>
+                          <a:stretch>
+                            <a:fillRect/>
+                          </a:stretch>
+                        </pic:blipFill>
+                        <pic:spPr bwMode="auto">
+                          <a:xfrm>
+                            <a:off x="0" y="0"/>
+                            <a:ext cx="923925" cy="2047875"/>
+                          </a:xfrm>
+                          <a:prstGeom prst="rect">
+                            <a:avLst/>
+                          </a:prstGeom>
+                        </pic:spPr>
+                      </pic:pic>
+                    </a:graphicData>
+                  </a:graphic>
+                </wp:inline>
+              </w:drawing>
+            </w:r>
+          </w:p>
+        </w:tc>
+        <w:tc>
+          <w:tcPr>
+            <w:tcW w:type="dxa" w:w="3213"/>
+            <w:tcBorders>
+              <w:top w:val="none" w:color="FFFFFF" w:sz="0"/>
+              <w:left w:val="none" w:color="FFFFFF" w:sz="0"/>
+              <w:bottom w:val="none" w:color="FFFFFF" w:sz="0"/>
+              <w:right w:val="none" w:color="FFFFFF" w:sz="0"/>
+            </w:tcBorders>
+          </w:tcPr>
+          <w:p>
+            <w:pPr>
+              <w:jc w:val="center"/>
+            </w:pPr>
+            <w:r>
+              <w:drawing>
+                <wp:inline distT="0" distB="0" distL="0" distR="0">
+                  <wp:extent cx="923925" cy="2047875"/>
+                  <wp:effectExtent t="0" r="0" b="0" l="0"/>
+                  <wp:docPr id="1" name="captura-13" descr="Panel de empresa: edición de la portada del negocio sin guardar." title="Captura INC-07"/>
+                  <wp:cNvGraphicFramePr>
+                    <a:graphicFrameLocks xmlns:a="http://schemas.openxmlformats.org/drawingml/2006/main" noChangeAspect="1"/>
+                  </wp:cNvGraphicFramePr>
+                  <a:graphic xmlns:a="http://schemas.openxmlformats.org/drawingml/2006/main">
+                    <a:graphicData uri="http://schemas.openxmlformats.org/drawingml/2006/picture">
+                      <pic:pic xmlns:pic="http://schemas.openxmlformats.org/drawingml/2006/picture">
+                        <pic:nvPicPr>
+                          <pic:cNvPr id="0" name="" descr=""/>
+                          <pic:cNvPicPr>
+                            <a:picLocks noChangeAspect="1" noChangeArrowheads="1"/>
+                          </pic:cNvPicPr>
+                        </pic:nvPicPr>
+                        <pic:blipFill>
+                          <a:blip r:embed="rId22" cstate="none"/>
+                          <a:srcRect/>
+                          <a:stretch>
+                            <a:fillRect/>
+                          </a:stretch>
+                        </pic:blipFill>
+                        <pic:spPr bwMode="auto">
+                          <a:xfrm>
+                            <a:off x="0" y="0"/>
+                            <a:ext cx="923925" cy="2047875"/>
+                          </a:xfrm>
+                          <a:prstGeom prst="rect">
+                            <a:avLst/>
+                          </a:prstGeom>
+                        </pic:spPr>
+                      </pic:pic>
+                    </a:graphicData>
+                  </a:graphic>
+                </wp:inline>
+              </w:drawing>
+            </w:r>
+          </w:p>
+        </w:tc>
+        <w:tc>
+          <w:tcPr>
+            <w:tcW w:type="dxa" w:w="3213"/>
+            <w:tcBorders>
+              <w:top w:val="none" w:color="FFFFFF" w:sz="0"/>
+              <w:left w:val="none" w:color="FFFFFF" w:sz="0"/>
+              <w:bottom w:val="none" w:color="FFFFFF" w:sz="0"/>
+              <w:right w:val="none" w:color="FFFFFF" w:sz="0"/>
+            </w:tcBorders>
+          </w:tcPr>
+          <w:p>
+            <w:pPr>
+              <w:jc w:val="center"/>
+            </w:pPr>
+            <w:r>
+              <w:drawing>
+                <wp:inline distT="0" distB="0" distL="0" distR="0">
+                  <wp:extent cx="923925" cy="2047875"/>
+                  <wp:effectExtent t="0" r="0" b="0" l="0"/>
+                  <wp:docPr id="1" name="captura-14" descr="Panel de empresa: edición de la portada del negocio sin guardar." title="Captura INC-07"/>
+                  <wp:cNvGraphicFramePr>
+                    <a:graphicFrameLocks xmlns:a="http://schemas.openxmlformats.org/drawingml/2006/main" noChangeAspect="1"/>
+                  </wp:cNvGraphicFramePr>
+                  <a:graphic xmlns:a="http://schemas.openxmlformats.org/drawingml/2006/main">
+                    <a:graphicData uri="http://schemas.openxmlformats.org/drawingml/2006/picture">
+                      <pic:pic xmlns:pic="http://schemas.openxmlformats.org/drawingml/2006/picture">
+                        <pic:nvPicPr>
+                          <pic:cNvPr id="0" name="" descr=""/>
+                          <pic:cNvPicPr>
+                            <a:picLocks noChangeAspect="1" noChangeArrowheads="1"/>
+                          </pic:cNvPicPr>
+                        </pic:nvPicPr>
+                        <pic:blipFill>
+                          <a:blip r:embed="rId23" cstate="none"/>
+                          <a:srcRect/>
+                          <a:stretch>
+                            <a:fillRect/>
+                          </a:stretch>
+                        </pic:blipFill>
+                        <pic:spPr bwMode="auto">
+                          <a:xfrm>
+                            <a:off x="0" y="0"/>
+                            <a:ext cx="923925" cy="2047875"/>
+                          </a:xfrm>
+                          <a:prstGeom prst="rect">
+                            <a:avLst/>
+                          </a:prstGeom>
+                        </pic:spPr>
+                      </pic:pic>
+                    </a:graphicData>
+                  </a:graphic>
+                </wp:inline>
+              </w:drawing>
+            </w:r>
+          </w:p>
+        </w:tc>
+      </w:tr>
+    </w:tbl>
+    <w:p>
+      <w:pPr>
+        <w:spacing w:after="200" w:before="60"/>
+        <w:jc w:val="center"/>
+      </w:pPr>
+      <w:r>
+        <w:rPr>
+          <w:i/>
+          <w:iCs/>
+          <w:color w:val="5B6573"/>
+          <w:sz w:val="18"/>
+          <w:szCs w:val="18"/>
+        </w:rPr>
+        <w:t xml:space="preserve">Figura 7. Panel de empresa: edición de la portada del negocio sin guardar. </w:t>
+      </w:r>
+      <w:r>
+        <w:rPr>
+          <w:color w:val="5B6573"/>
+          <w:sz w:val="17"/>
+          <w:szCs w:val="17"/>
+        </w:rPr>
+        <w:t xml:space="preserve">Captura tomada en un teléfono Android antes de la corrección.</w:t>
       </w:r>
     </w:p>
     <w:tbl>
@@ -8832,16 +9837,110 @@
     </w:tbl>
     <w:p>
       <w:pPr>
-        <w:spacing w:after="200"/>
-      </w:pPr>
-    </w:p>
-    <w:p>
-      <w:pPr>
         <w:pStyle w:val="Heading2"/>
         <w:pageBreakBefore/>
       </w:pPr>
       <w:r>
         <w:t xml:space="preserve">3.8 INC-08 — Las imágenes agregadas a la galería del local se aplican sin guardar</w:t>
+      </w:r>
+    </w:p>
+    <w:tbl>
+      <w:tblPr>
+        <w:tblW w:type="dxa" w:w="3213"/>
+        <w:jc w:val="center"/>
+        <w:tblBorders>
+          <w:top w:val="single" w:color="auto" w:sz="4"/>
+          <w:left w:val="single" w:color="auto" w:sz="4"/>
+          <w:bottom w:val="single" w:color="auto" w:sz="4"/>
+          <w:right w:val="single" w:color="auto" w:sz="4"/>
+          <w:insideH w:val="single" w:color="auto" w:sz="4"/>
+          <w:insideV w:val="single" w:color="auto" w:sz="4"/>
+        </w:tblBorders>
+      </w:tblPr>
+      <w:tblGrid>
+        <w:gridCol w:w="3213"/>
+      </w:tblGrid>
+      <w:tr>
+        <w:tc>
+          <w:tcPr>
+            <w:tcW w:type="dxa" w:w="3213"/>
+            <w:tcBorders>
+              <w:top w:val="none" w:color="FFFFFF" w:sz="0"/>
+              <w:left w:val="none" w:color="FFFFFF" w:sz="0"/>
+              <w:bottom w:val="none" w:color="FFFFFF" w:sz="0"/>
+              <w:right w:val="none" w:color="FFFFFF" w:sz="0"/>
+            </w:tcBorders>
+          </w:tcPr>
+          <w:p>
+            <w:pPr>
+              <w:jc w:val="center"/>
+            </w:pPr>
+            <w:r>
+              <w:drawing>
+                <wp:inline distT="0" distB="0" distL="0" distR="0">
+                  <wp:extent cx="923925" cy="2047875"/>
+                  <wp:effectExtent t="0" r="0" b="0" l="0"/>
+                  <wp:docPr id="1" name="captura-15" descr="Galería del local con una imagen agregada sin guardar." title="Captura INC-08"/>
+                  <wp:cNvGraphicFramePr>
+                    <a:graphicFrameLocks xmlns:a="http://schemas.openxmlformats.org/drawingml/2006/main" noChangeAspect="1"/>
+                  </wp:cNvGraphicFramePr>
+                  <a:graphic xmlns:a="http://schemas.openxmlformats.org/drawingml/2006/main">
+                    <a:graphicData uri="http://schemas.openxmlformats.org/drawingml/2006/picture">
+                      <pic:pic xmlns:pic="http://schemas.openxmlformats.org/drawingml/2006/picture">
+                        <pic:nvPicPr>
+                          <pic:cNvPr id="0" name="" descr=""/>
+                          <pic:cNvPicPr>
+                            <a:picLocks noChangeAspect="1" noChangeArrowheads="1"/>
+                          </pic:cNvPicPr>
+                        </pic:nvPicPr>
+                        <pic:blipFill>
+                          <a:blip r:embed="rId24" cstate="none"/>
+                          <a:srcRect/>
+                          <a:stretch>
+                            <a:fillRect/>
+                          </a:stretch>
+                        </pic:blipFill>
+                        <pic:spPr bwMode="auto">
+                          <a:xfrm>
+                            <a:off x="0" y="0"/>
+                            <a:ext cx="923925" cy="2047875"/>
+                          </a:xfrm>
+                          <a:prstGeom prst="rect">
+                            <a:avLst/>
+                          </a:prstGeom>
+                        </pic:spPr>
+                      </pic:pic>
+                    </a:graphicData>
+                  </a:graphic>
+                </wp:inline>
+              </w:drawing>
+            </w:r>
+          </w:p>
+        </w:tc>
+      </w:tr>
+    </w:tbl>
+    <w:p>
+      <w:pPr>
+        <w:spacing w:after="200" w:before="60"/>
+        <w:jc w:val="center"/>
+      </w:pPr>
+      <w:r>
+        <w:rPr>
+          <w:i/>
+          <w:iCs/>
+          <w:color w:val="5B6573"/>
+          <w:sz w:val="18"/>
+          <w:szCs w:val="18"/>
+        </w:rPr>
+        <w:t xml:space="preserve">Figura 8. Galería del local con una imagen agregada sin guardar. </w:t>
+      </w:r>
+      <w:r>
+        <w:rPr>
+          <w:color w:val="5B6573"/>
+          <w:sz w:val="17"/>
+          <w:szCs w:val="17"/>
+        </w:rPr>
+        <w:t xml:space="preserve">Captura tomada en un teléfono Android antes de la corrección.</w:t>
       </w:r>
     </w:p>
     <w:tbl>
@@ -9680,16 +10779,110 @@
     </w:tbl>
     <w:p>
       <w:pPr>
-        <w:spacing w:after="200"/>
-      </w:pPr>
-    </w:p>
-    <w:p>
-      <w:pPr>
         <w:pStyle w:val="Heading2"/>
         <w:pageBreakBefore/>
       </w:pPr>
       <w:r>
         <w:t xml:space="preserve">3.9 OBS-01 — El corazón de favoritos se ve demasiado oscuro en modo claro</w:t>
+      </w:r>
+    </w:p>
+    <w:tbl>
+      <w:tblPr>
+        <w:tblW w:type="dxa" w:w="3213"/>
+        <w:jc w:val="center"/>
+        <w:tblBorders>
+          <w:top w:val="single" w:color="auto" w:sz="4"/>
+          <w:left w:val="single" w:color="auto" w:sz="4"/>
+          <w:bottom w:val="single" w:color="auto" w:sz="4"/>
+          <w:right w:val="single" w:color="auto" w:sz="4"/>
+          <w:insideH w:val="single" w:color="auto" w:sz="4"/>
+          <w:insideV w:val="single" w:color="auto" w:sz="4"/>
+        </w:tblBorders>
+      </w:tblPr>
+      <w:tblGrid>
+        <w:gridCol w:w="3213"/>
+      </w:tblGrid>
+      <w:tr>
+        <w:tc>
+          <w:tcPr>
+            <w:tcW w:type="dxa" w:w="3213"/>
+            <w:tcBorders>
+              <w:top w:val="none" w:color="FFFFFF" w:sz="0"/>
+              <w:left w:val="none" w:color="FFFFFF" w:sz="0"/>
+              <w:bottom w:val="none" w:color="FFFFFF" w:sz="0"/>
+              <w:right w:val="none" w:color="FFFFFF" w:sz="0"/>
+            </w:tcBorders>
+          </w:tcPr>
+          <w:p>
+            <w:pPr>
+              <w:jc w:val="center"/>
+            </w:pPr>
+            <w:r>
+              <w:drawing>
+                <wp:inline distT="0" distB="0" distL="0" distR="0">
+                  <wp:extent cx="923925" cy="2047875"/>
+                  <wp:effectExtent t="0" r="0" b="0" l="0"/>
+                  <wp:docPr id="1" name="captura-8" descr="Tarjeta de lugar destacado en modo claro con el ícono de favoritos." title="Captura OBS-01"/>
+                  <wp:cNvGraphicFramePr>
+                    <a:graphicFrameLocks xmlns:a="http://schemas.openxmlformats.org/drawingml/2006/main" noChangeAspect="1"/>
+                  </wp:cNvGraphicFramePr>
+                  <a:graphic xmlns:a="http://schemas.openxmlformats.org/drawingml/2006/main">
+                    <a:graphicData uri="http://schemas.openxmlformats.org/drawingml/2006/picture">
+                      <pic:pic xmlns:pic="http://schemas.openxmlformats.org/drawingml/2006/picture">
+                        <pic:nvPicPr>
+                          <pic:cNvPr id="0" name="" descr=""/>
+                          <pic:cNvPicPr>
+                            <a:picLocks noChangeAspect="1" noChangeArrowheads="1"/>
+                          </pic:cNvPicPr>
+                        </pic:nvPicPr>
+                        <pic:blipFill>
+                          <a:blip r:embed="rId25" cstate="none"/>
+                          <a:srcRect/>
+                          <a:stretch>
+                            <a:fillRect/>
+                          </a:stretch>
+                        </pic:blipFill>
+                        <pic:spPr bwMode="auto">
+                          <a:xfrm>
+                            <a:off x="0" y="0"/>
+                            <a:ext cx="923925" cy="2047875"/>
+                          </a:xfrm>
+                          <a:prstGeom prst="rect">
+                            <a:avLst/>
+                          </a:prstGeom>
+                        </pic:spPr>
+                      </pic:pic>
+                    </a:graphicData>
+                  </a:graphic>
+                </wp:inline>
+              </w:drawing>
+            </w:r>
+          </w:p>
+        </w:tc>
+      </w:tr>
+    </w:tbl>
+    <w:p>
+      <w:pPr>
+        <w:spacing w:after="200" w:before="60"/>
+        <w:jc w:val="center"/>
+      </w:pPr>
+      <w:r>
+        <w:rPr>
+          <w:i/>
+          <w:iCs/>
+          <w:color w:val="5B6573"/>
+          <w:sz w:val="18"/>
+          <w:szCs w:val="18"/>
+        </w:rPr>
+        <w:t xml:space="preserve">Figura 9. Tarjeta de lugar destacado en modo claro con el ícono de favoritos. </w:t>
+      </w:r>
+      <w:r>
+        <w:rPr>
+          <w:color w:val="5B6573"/>
+          <w:sz w:val="17"/>
+          <w:szCs w:val="17"/>
+        </w:rPr>
+        <w:t xml:space="preserve">Captura tomada en un teléfono Android antes de la corrección.</w:t>
       </w:r>
     </w:p>
     <w:tbl>
@@ -10508,11 +11701,6 @@
         </w:tc>
       </w:tr>
     </w:tbl>
-    <w:p>
-      <w:pPr>
-        <w:spacing w:after="200"/>
-      </w:pPr>
-    </w:p>
     <w:p>
       <w:r>
         <w:br w:type="page"/>

</xml_diff>

<commit_message>
Corrige aviso del mapa sobre el copyright y agrega el logo nuevo a la app movil
- explorar_mapa_page: aviso 'Datos de ejemplo' y controles del mapa por encima de los creditos de OpenStreetMap
- apps/mobile: logo_light.png y logo_dark.png copiados y declarados en pubspec.yaml
- Reporte de incidencias actualizado (INC-09, INC-10, merge con main, 41 de 41 pruebas)
</commit_message>
<xml_diff>
--- a/docs/reports/Reporte_Incidencias_TouristMAR.docx
+++ b/docs/reports/Reporte_Incidencias_TouristMAR.docx
@@ -551,7 +551,7 @@
                 <w:sz w:val="20"/>
                 <w:szCs w:val="20"/>
               </w:rPr>
-              <w:t xml:space="preserve">9 de 9 incidencias corregidas y verificadas</w:t>
+              <w:t xml:space="preserve">11 de 11 incidencias corregidas (9 verificadas con pruebas automatizadas; 2 pendientes de validación en dispositivo)</w:t>
             </w:r>
           </w:p>
         </w:tc>
@@ -703,7 +703,7 @@
         <w:jc w:val="both"/>
       </w:pPr>
       <w:r>
-        <w:t xml:space="preserve">Se reportaron 9 incidencias. La siguiente tabla resume su clasificación y estado actual.</w:t>
+        <w:t xml:space="preserve">Se reportaron 11 incidencias. La siguiente tabla resume su clasificación y estado actual.</w:t>
       </w:r>
     </w:p>
     <w:p>
@@ -2445,6 +2445,347 @@
                 <w:b/>
                 <w:bCs/>
                 <w:color w:val="027A48"/>
+                <w:sz w:val="20"/>
+                <w:szCs w:val="20"/>
+              </w:rPr>
+              <w:t xml:space="preserve">Corregido</w:t>
+            </w:r>
+          </w:p>
+        </w:tc>
+      </w:tr>
+      <w:tr>
+        <w:trPr>
+          <w:cantSplit/>
+        </w:trPr>
+        <w:tc>
+          <w:tcPr>
+            <w:tcW w:type="dxa" w:w="1000"/>
+            <w:tcBorders>
+              <w:top w:val="single" w:color="C9D1DA" w:sz="4"/>
+              <w:left w:val="single" w:color="C9D1DA" w:sz="4"/>
+              <w:bottom w:val="single" w:color="C9D1DA" w:sz="4"/>
+              <w:right w:val="single" w:color="C9D1DA" w:sz="4"/>
+            </w:tcBorders>
+            <w:shd w:fill="F3F5F7" w:color="auto" w:val="clear"/>
+            <w:tcMar>
+              <w:top w:type="dxa" w:w="90"/>
+              <w:left w:type="dxa" w:w="140"/>
+              <w:bottom w:type="dxa" w:w="90"/>
+              <w:right w:type="dxa" w:w="140"/>
+            </w:tcMar>
+            <w:vAlign w:val="center"/>
+          </w:tcPr>
+          <w:p>
+            <w:pPr>
+              <w:spacing w:after="40" w:line="252"/>
+              <w:jc w:val="left"/>
+            </w:pPr>
+            <w:r>
+              <w:rPr>
+                <w:b/>
+                <w:bCs/>
+                <w:sz w:val="20"/>
+                <w:szCs w:val="20"/>
+              </w:rPr>
+              <w:t xml:space="preserve">INC-09</w:t>
+            </w:r>
+          </w:p>
+        </w:tc>
+        <w:tc>
+          <w:tcPr>
+            <w:tcW w:type="dxa" w:w="3900"/>
+            <w:tcBorders>
+              <w:top w:val="single" w:color="C9D1DA" w:sz="4"/>
+              <w:left w:val="single" w:color="C9D1DA" w:sz="4"/>
+              <w:bottom w:val="single" w:color="C9D1DA" w:sz="4"/>
+              <w:right w:val="single" w:color="C9D1DA" w:sz="4"/>
+            </w:tcBorders>
+            <w:shd w:fill="F3F5F7" w:color="auto" w:val="clear"/>
+            <w:tcMar>
+              <w:top w:type="dxa" w:w="90"/>
+              <w:left w:type="dxa" w:w="140"/>
+              <w:bottom w:type="dxa" w:w="90"/>
+              <w:right w:type="dxa" w:w="140"/>
+            </w:tcMar>
+            <w:vAlign w:val="center"/>
+          </w:tcPr>
+          <w:p>
+            <w:pPr>
+              <w:spacing w:after="40" w:line="252"/>
+              <w:jc w:val="left"/>
+            </w:pPr>
+            <w:r>
+              <w:rPr>
+                <w:sz w:val="20"/>
+                <w:szCs w:val="20"/>
+              </w:rPr>
+              <w:t xml:space="preserve">El aviso «Datos de ejemplo» se encima con los créditos del mapa</w:t>
+            </w:r>
+          </w:p>
+        </w:tc>
+        <w:tc>
+          <w:tcPr>
+            <w:tcW w:type="dxa" w:w="1900"/>
+            <w:tcBorders>
+              <w:top w:val="single" w:color="C9D1DA" w:sz="4"/>
+              <w:left w:val="single" w:color="C9D1DA" w:sz="4"/>
+              <w:bottom w:val="single" w:color="C9D1DA" w:sz="4"/>
+              <w:right w:val="single" w:color="C9D1DA" w:sz="4"/>
+            </w:tcBorders>
+            <w:shd w:fill="F3F5F7" w:color="auto" w:val="clear"/>
+            <w:tcMar>
+              <w:top w:type="dxa" w:w="90"/>
+              <w:left w:type="dxa" w:w="140"/>
+              <w:bottom w:type="dxa" w:w="90"/>
+              <w:right w:type="dxa" w:w="140"/>
+            </w:tcMar>
+            <w:vAlign w:val="center"/>
+          </w:tcPr>
+          <w:p>
+            <w:pPr>
+              <w:spacing w:after="40" w:line="252"/>
+              <w:jc w:val="left"/>
+            </w:pPr>
+            <w:r>
+              <w:rPr>
+                <w:sz w:val="20"/>
+                <w:szCs w:val="20"/>
+              </w:rPr>
+              <w:t xml:space="preserve">Explorar mapa</w:t>
+            </w:r>
+          </w:p>
+        </w:tc>
+        <w:tc>
+          <w:tcPr>
+            <w:tcW w:type="dxa" w:w="1200"/>
+            <w:tcBorders>
+              <w:top w:val="single" w:color="C9D1DA" w:sz="4"/>
+              <w:left w:val="single" w:color="C9D1DA" w:sz="4"/>
+              <w:bottom w:val="single" w:color="C9D1DA" w:sz="4"/>
+              <w:right w:val="single" w:color="C9D1DA" w:sz="4"/>
+            </w:tcBorders>
+            <w:shd w:fill="F3F5F7" w:color="auto" w:val="clear"/>
+            <w:tcMar>
+              <w:top w:type="dxa" w:w="90"/>
+              <w:left w:type="dxa" w:w="140"/>
+              <w:bottom w:type="dxa" w:w="90"/>
+              <w:right w:type="dxa" w:w="140"/>
+            </w:tcMar>
+            <w:vAlign w:val="center"/>
+          </w:tcPr>
+          <w:p>
+            <w:pPr>
+              <w:spacing w:after="40" w:line="252"/>
+              <w:jc w:val="left"/>
+            </w:pPr>
+            <w:r>
+              <w:rPr>
+                <w:b/>
+                <w:bCs/>
+                <w:color w:val="B54708"/>
+                <w:sz w:val="20"/>
+                <w:szCs w:val="20"/>
+              </w:rPr>
+              <w:t xml:space="preserve">Media</w:t>
+            </w:r>
+          </w:p>
+        </w:tc>
+        <w:tc>
+          <w:tcPr>
+            <w:tcW w:type="dxa" w:w="1640"/>
+            <w:tcBorders>
+              <w:top w:val="single" w:color="C9D1DA" w:sz="4"/>
+              <w:left w:val="single" w:color="C9D1DA" w:sz="4"/>
+              <w:bottom w:val="single" w:color="C9D1DA" w:sz="4"/>
+              <w:right w:val="single" w:color="C9D1DA" w:sz="4"/>
+            </w:tcBorders>
+            <w:shd w:fill="F3F5F7" w:color="auto" w:val="clear"/>
+            <w:tcMar>
+              <w:top w:type="dxa" w:w="90"/>
+              <w:left w:type="dxa" w:w="140"/>
+              <w:bottom w:type="dxa" w:w="90"/>
+              <w:right w:type="dxa" w:w="140"/>
+            </w:tcMar>
+            <w:vAlign w:val="center"/>
+          </w:tcPr>
+          <w:p>
+            <w:pPr>
+              <w:spacing w:after="40" w:line="252"/>
+              <w:jc w:val="left"/>
+            </w:pPr>
+            <w:r>
+              <w:rPr>
+                <w:b/>
+                <w:bCs/>
+                <w:color w:val="B54708"/>
+                <w:sz w:val="20"/>
+                <w:szCs w:val="20"/>
+              </w:rPr>
+              <w:t xml:space="preserve">Corregido</w:t>
+            </w:r>
+          </w:p>
+        </w:tc>
+      </w:tr>
+      <w:tr>
+        <w:trPr>
+          <w:cantSplit/>
+        </w:trPr>
+        <w:tc>
+          <w:tcPr>
+            <w:tcW w:type="dxa" w:w="1000"/>
+            <w:tcBorders>
+              <w:top w:val="single" w:color="C9D1DA" w:sz="4"/>
+              <w:left w:val="single" w:color="C9D1DA" w:sz="4"/>
+              <w:bottom w:val="single" w:color="C9D1DA" w:sz="4"/>
+              <w:right w:val="single" w:color="C9D1DA" w:sz="4"/>
+            </w:tcBorders>
+            <w:tcMar>
+              <w:top w:type="dxa" w:w="90"/>
+              <w:left w:type="dxa" w:w="140"/>
+              <w:bottom w:type="dxa" w:w="90"/>
+              <w:right w:type="dxa" w:w="140"/>
+            </w:tcMar>
+            <w:vAlign w:val="center"/>
+          </w:tcPr>
+          <w:p>
+            <w:pPr>
+              <w:spacing w:after="40" w:line="252"/>
+              <w:jc w:val="left"/>
+            </w:pPr>
+            <w:r>
+              <w:rPr>
+                <w:b/>
+                <w:bCs/>
+                <w:sz w:val="20"/>
+                <w:szCs w:val="20"/>
+              </w:rPr>
+              <w:t xml:space="preserve">INC-10</w:t>
+            </w:r>
+          </w:p>
+        </w:tc>
+        <w:tc>
+          <w:tcPr>
+            <w:tcW w:type="dxa" w:w="3900"/>
+            <w:tcBorders>
+              <w:top w:val="single" w:color="C9D1DA" w:sz="4"/>
+              <w:left w:val="single" w:color="C9D1DA" w:sz="4"/>
+              <w:bottom w:val="single" w:color="C9D1DA" w:sz="4"/>
+              <w:right w:val="single" w:color="C9D1DA" w:sz="4"/>
+            </w:tcBorders>
+            <w:tcMar>
+              <w:top w:type="dxa" w:w="90"/>
+              <w:left w:type="dxa" w:w="140"/>
+              <w:bottom w:type="dxa" w:w="90"/>
+              <w:right w:type="dxa" w:w="140"/>
+            </w:tcMar>
+            <w:vAlign w:val="center"/>
+          </w:tcPr>
+          <w:p>
+            <w:pPr>
+              <w:spacing w:after="40" w:line="252"/>
+              <w:jc w:val="left"/>
+            </w:pPr>
+            <w:r>
+              <w:rPr>
+                <w:sz w:val="20"/>
+                <w:szCs w:val="20"/>
+              </w:rPr>
+              <w:t xml:space="preserve">El logo nuevo (palmera) no carga en la app móvil</w:t>
+            </w:r>
+          </w:p>
+        </w:tc>
+        <w:tc>
+          <w:tcPr>
+            <w:tcW w:type="dxa" w:w="1900"/>
+            <w:tcBorders>
+              <w:top w:val="single" w:color="C9D1DA" w:sz="4"/>
+              <w:left w:val="single" w:color="C9D1DA" w:sz="4"/>
+              <w:bottom w:val="single" w:color="C9D1DA" w:sz="4"/>
+              <w:right w:val="single" w:color="C9D1DA" w:sz="4"/>
+            </w:tcBorders>
+            <w:tcMar>
+              <w:top w:type="dxa" w:w="90"/>
+              <w:left w:type="dxa" w:w="140"/>
+              <w:bottom w:type="dxa" w:w="90"/>
+              <w:right w:type="dxa" w:w="140"/>
+            </w:tcMar>
+            <w:vAlign w:val="center"/>
+          </w:tcPr>
+          <w:p>
+            <w:pPr>
+              <w:spacing w:after="40" w:line="252"/>
+              <w:jc w:val="left"/>
+            </w:pPr>
+            <w:r>
+              <w:rPr>
+                <w:sz w:val="20"/>
+                <w:szCs w:val="20"/>
+              </w:rPr>
+              <w:t xml:space="preserve">Identidad visual (app móvil)</w:t>
+            </w:r>
+          </w:p>
+        </w:tc>
+        <w:tc>
+          <w:tcPr>
+            <w:tcW w:type="dxa" w:w="1200"/>
+            <w:tcBorders>
+              <w:top w:val="single" w:color="C9D1DA" w:sz="4"/>
+              <w:left w:val="single" w:color="C9D1DA" w:sz="4"/>
+              <w:bottom w:val="single" w:color="C9D1DA" w:sz="4"/>
+              <w:right w:val="single" w:color="C9D1DA" w:sz="4"/>
+            </w:tcBorders>
+            <w:tcMar>
+              <w:top w:type="dxa" w:w="90"/>
+              <w:left w:type="dxa" w:w="140"/>
+              <w:bottom w:type="dxa" w:w="90"/>
+              <w:right w:type="dxa" w:w="140"/>
+            </w:tcMar>
+            <w:vAlign w:val="center"/>
+          </w:tcPr>
+          <w:p>
+            <w:pPr>
+              <w:spacing w:after="40" w:line="252"/>
+              <w:jc w:val="left"/>
+            </w:pPr>
+            <w:r>
+              <w:rPr>
+                <w:b/>
+                <w:bCs/>
+                <w:color w:val="B54708"/>
+                <w:sz w:val="20"/>
+                <w:szCs w:val="20"/>
+              </w:rPr>
+              <w:t xml:space="preserve">Media</w:t>
+            </w:r>
+          </w:p>
+        </w:tc>
+        <w:tc>
+          <w:tcPr>
+            <w:tcW w:type="dxa" w:w="1640"/>
+            <w:tcBorders>
+              <w:top w:val="single" w:color="C9D1DA" w:sz="4"/>
+              <w:left w:val="single" w:color="C9D1DA" w:sz="4"/>
+              <w:bottom w:val="single" w:color="C9D1DA" w:sz="4"/>
+              <w:right w:val="single" w:color="C9D1DA" w:sz="4"/>
+            </w:tcBorders>
+            <w:tcMar>
+              <w:top w:type="dxa" w:w="90"/>
+              <w:left w:type="dxa" w:w="140"/>
+              <w:bottom w:type="dxa" w:w="90"/>
+              <w:right w:type="dxa" w:w="140"/>
+            </w:tcMar>
+            <w:vAlign w:val="center"/>
+          </w:tcPr>
+          <w:p>
+            <w:pPr>
+              <w:spacing w:after="40" w:line="252"/>
+              <w:jc w:val="left"/>
+            </w:pPr>
+            <w:r>
+              <w:rPr>
+                <w:b/>
+                <w:bCs/>
+                <w:color w:val="B54708"/>
                 <w:sz w:val="20"/>
                 <w:szCs w:val="20"/>
               </w:rPr>
@@ -11696,6 +12037,1954 @@
                 <w:szCs w:val="20"/>
               </w:rPr>
               <w:t xml:space="preserve">Corregido y verificado con pruebas automatizadas</w:t>
+            </w:r>
+          </w:p>
+        </w:tc>
+      </w:tr>
+    </w:tbl>
+    <w:p>
+      <w:pPr>
+        <w:pStyle w:val="Heading2"/>
+        <w:pageBreakBefore/>
+      </w:pPr>
+      <w:r>
+        <w:t xml:space="preserve">3.10 INC-09 — El aviso «Datos de ejemplo» se encima con los créditos del mapa</w:t>
+      </w:r>
+    </w:p>
+    <w:tbl>
+      <w:tblPr>
+        <w:tblW w:type="dxa" w:w="3213"/>
+        <w:jc w:val="center"/>
+        <w:tblBorders>
+          <w:top w:val="single" w:color="auto" w:sz="4"/>
+          <w:left w:val="single" w:color="auto" w:sz="4"/>
+          <w:bottom w:val="single" w:color="auto" w:sz="4"/>
+          <w:right w:val="single" w:color="auto" w:sz="4"/>
+          <w:insideH w:val="single" w:color="auto" w:sz="4"/>
+          <w:insideV w:val="single" w:color="auto" w:sz="4"/>
+        </w:tblBorders>
+      </w:tblPr>
+      <w:tblGrid>
+        <w:gridCol w:w="3213"/>
+      </w:tblGrid>
+      <w:tr>
+        <w:tc>
+          <w:tcPr>
+            <w:tcW w:type="dxa" w:w="3213"/>
+            <w:tcBorders>
+              <w:top w:val="none" w:color="FFFFFF" w:sz="0"/>
+              <w:left w:val="none" w:color="FFFFFF" w:sz="0"/>
+              <w:bottom w:val="none" w:color="FFFFFF" w:sz="0"/>
+              <w:right w:val="none" w:color="FFFFFF" w:sz="0"/>
+            </w:tcBorders>
+          </w:tcPr>
+          <w:p>
+            <w:pPr>
+              <w:jc w:val="center"/>
+            </w:pPr>
+            <w:r>
+              <w:drawing>
+                <wp:inline distT="0" distB="0" distL="0" distR="0">
+                  <wp:extent cx="923925" cy="2047875"/>
+                  <wp:effectExtent t="0" r="0" b="0" l="0"/>
+                  <wp:docPr id="1" name="captura-mapa.jpg" descr="Mapa: el aviso «Datos de ejemplo» y el botón de ubicación tapan los créditos de OpenStreetMap." title="Captura INC-09"/>
+                  <wp:cNvGraphicFramePr>
+                    <a:graphicFrameLocks xmlns:a="http://schemas.openxmlformats.org/drawingml/2006/main" noChangeAspect="1"/>
+                  </wp:cNvGraphicFramePr>
+                  <a:graphic xmlns:a="http://schemas.openxmlformats.org/drawingml/2006/main">
+                    <a:graphicData uri="http://schemas.openxmlformats.org/drawingml/2006/picture">
+                      <pic:pic xmlns:pic="http://schemas.openxmlformats.org/drawingml/2006/picture">
+                        <pic:nvPicPr>
+                          <pic:cNvPr id="0" name="" descr=""/>
+                          <pic:cNvPicPr>
+                            <a:picLocks noChangeAspect="1" noChangeArrowheads="1"/>
+                          </pic:cNvPicPr>
+                        </pic:nvPicPr>
+                        <pic:blipFill>
+                          <a:blip r:embed="rId26" cstate="none"/>
+                          <a:srcRect/>
+                          <a:stretch>
+                            <a:fillRect/>
+                          </a:stretch>
+                        </pic:blipFill>
+                        <pic:spPr bwMode="auto">
+                          <a:xfrm>
+                            <a:off x="0" y="0"/>
+                            <a:ext cx="923925" cy="2047875"/>
+                          </a:xfrm>
+                          <a:prstGeom prst="rect">
+                            <a:avLst/>
+                          </a:prstGeom>
+                        </pic:spPr>
+                      </pic:pic>
+                    </a:graphicData>
+                  </a:graphic>
+                </wp:inline>
+              </w:drawing>
+            </w:r>
+          </w:p>
+        </w:tc>
+      </w:tr>
+    </w:tbl>
+    <w:p>
+      <w:pPr>
+        <w:spacing w:after="200" w:before="60"/>
+        <w:jc w:val="center"/>
+      </w:pPr>
+      <w:r>
+        <w:rPr>
+          <w:i/>
+          <w:iCs/>
+          <w:color w:val="5B6573"/>
+          <w:sz w:val="18"/>
+          <w:szCs w:val="18"/>
+        </w:rPr>
+        <w:t xml:space="preserve">Figura 10. Mapa: el aviso «Datos de ejemplo» y el botón de ubicación tapan los créditos de OpenStreetMap. </w:t>
+      </w:r>
+      <w:r>
+        <w:rPr>
+          <w:color w:val="5B6573"/>
+          <w:sz w:val="17"/>
+          <w:szCs w:val="17"/>
+        </w:rPr>
+        <w:t xml:space="preserve">Captura tomada en un teléfono Android antes de la corrección.</w:t>
+      </w:r>
+    </w:p>
+    <w:tbl>
+      <w:tblPr>
+        <w:tblW w:type="dxa" w:w="9640"/>
+        <w:tblBorders>
+          <w:top w:val="single" w:color="auto" w:sz="4"/>
+          <w:left w:val="single" w:color="auto" w:sz="4"/>
+          <w:bottom w:val="single" w:color="auto" w:sz="4"/>
+          <w:right w:val="single" w:color="auto" w:sz="4"/>
+          <w:insideH w:val="single" w:color="auto" w:sz="4"/>
+          <w:insideV w:val="single" w:color="auto" w:sz="4"/>
+        </w:tblBorders>
+      </w:tblPr>
+      <w:tblGrid>
+        <w:gridCol w:w="2300"/>
+        <w:gridCol w:w="7340"/>
+      </w:tblGrid>
+      <w:tr>
+        <w:trPr>
+          <w:cantSplit/>
+        </w:trPr>
+        <w:tc>
+          <w:tcPr>
+            <w:tcW w:type="dxa" w:w="2300"/>
+            <w:tcBorders>
+              <w:top w:val="single" w:color="C9D1DA" w:sz="4"/>
+              <w:left w:val="single" w:color="C9D1DA" w:sz="4"/>
+              <w:bottom w:val="single" w:color="C9D1DA" w:sz="4"/>
+              <w:right w:val="single" w:color="C9D1DA" w:sz="4"/>
+            </w:tcBorders>
+            <w:shd w:fill="E6F4F7" w:color="auto" w:val="clear"/>
+            <w:tcMar>
+              <w:top w:type="dxa" w:w="90"/>
+              <w:left w:type="dxa" w:w="140"/>
+              <w:bottom w:type="dxa" w:w="90"/>
+              <w:right w:type="dxa" w:w="140"/>
+            </w:tcMar>
+            <w:vAlign w:val="center"/>
+          </w:tcPr>
+          <w:p>
+            <w:pPr>
+              <w:spacing w:after="40" w:line="252"/>
+              <w:jc w:val="left"/>
+            </w:pPr>
+            <w:r>
+              <w:rPr>
+                <w:b/>
+                <w:bCs/>
+                <w:color w:val="0B1F33"/>
+                <w:sz w:val="19"/>
+                <w:szCs w:val="19"/>
+              </w:rPr>
+              <w:t xml:space="preserve">Referencia original</w:t>
+            </w:r>
+          </w:p>
+        </w:tc>
+        <w:tc>
+          <w:tcPr>
+            <w:tcW w:type="dxa" w:w="7340"/>
+            <w:tcBorders>
+              <w:top w:val="single" w:color="C9D1DA" w:sz="4"/>
+              <w:left w:val="single" w:color="C9D1DA" w:sz="4"/>
+              <w:bottom w:val="single" w:color="C9D1DA" w:sz="4"/>
+              <w:right w:val="single" w:color="C9D1DA" w:sz="4"/>
+            </w:tcBorders>
+            <w:tcMar>
+              <w:top w:type="dxa" w:w="90"/>
+              <w:left w:type="dxa" w:w="140"/>
+              <w:bottom w:type="dxa" w:w="90"/>
+              <w:right w:type="dxa" w:w="140"/>
+            </w:tcMar>
+          </w:tcPr>
+          <w:p>
+            <w:pPr>
+              <w:spacing w:after="30" w:line="252"/>
+            </w:pPr>
+            <w:r>
+              <w:rPr>
+                <w:sz w:val="20"/>
+                <w:szCs w:val="20"/>
+              </w:rPr>
+              <w:t xml:space="preserve">Reporte posterior (mapa)</w:t>
+            </w:r>
+          </w:p>
+        </w:tc>
+      </w:tr>
+      <w:tr>
+        <w:trPr>
+          <w:cantSplit/>
+        </w:trPr>
+        <w:tc>
+          <w:tcPr>
+            <w:tcW w:type="dxa" w:w="2300"/>
+            <w:tcBorders>
+              <w:top w:val="single" w:color="C9D1DA" w:sz="4"/>
+              <w:left w:val="single" w:color="C9D1DA" w:sz="4"/>
+              <w:bottom w:val="single" w:color="C9D1DA" w:sz="4"/>
+              <w:right w:val="single" w:color="C9D1DA" w:sz="4"/>
+            </w:tcBorders>
+            <w:shd w:fill="E6F4F7" w:color="auto" w:val="clear"/>
+            <w:tcMar>
+              <w:top w:type="dxa" w:w="90"/>
+              <w:left w:type="dxa" w:w="140"/>
+              <w:bottom w:type="dxa" w:w="90"/>
+              <w:right w:type="dxa" w:w="140"/>
+            </w:tcMar>
+            <w:vAlign w:val="center"/>
+          </w:tcPr>
+          <w:p>
+            <w:pPr>
+              <w:spacing w:after="40" w:line="252"/>
+              <w:jc w:val="left"/>
+            </w:pPr>
+            <w:r>
+              <w:rPr>
+                <w:b/>
+                <w:bCs/>
+                <w:color w:val="0B1F33"/>
+                <w:sz w:val="19"/>
+                <w:szCs w:val="19"/>
+              </w:rPr>
+              <w:t xml:space="preserve">Módulo</w:t>
+            </w:r>
+          </w:p>
+        </w:tc>
+        <w:tc>
+          <w:tcPr>
+            <w:tcW w:type="dxa" w:w="7340"/>
+            <w:tcBorders>
+              <w:top w:val="single" w:color="C9D1DA" w:sz="4"/>
+              <w:left w:val="single" w:color="C9D1DA" w:sz="4"/>
+              <w:bottom w:val="single" w:color="C9D1DA" w:sz="4"/>
+              <w:right w:val="single" w:color="C9D1DA" w:sz="4"/>
+            </w:tcBorders>
+            <w:tcMar>
+              <w:top w:type="dxa" w:w="90"/>
+              <w:left w:type="dxa" w:w="140"/>
+              <w:bottom w:type="dxa" w:w="90"/>
+              <w:right w:type="dxa" w:w="140"/>
+            </w:tcMar>
+          </w:tcPr>
+          <w:p>
+            <w:pPr>
+              <w:spacing w:after="30" w:line="252"/>
+            </w:pPr>
+            <w:r>
+              <w:rPr>
+                <w:sz w:val="20"/>
+                <w:szCs w:val="20"/>
+              </w:rPr>
+              <w:t xml:space="preserve">Explorar mapa</w:t>
+            </w:r>
+          </w:p>
+        </w:tc>
+      </w:tr>
+      <w:tr>
+        <w:trPr>
+          <w:cantSplit/>
+        </w:trPr>
+        <w:tc>
+          <w:tcPr>
+            <w:tcW w:type="dxa" w:w="2300"/>
+            <w:tcBorders>
+              <w:top w:val="single" w:color="C9D1DA" w:sz="4"/>
+              <w:left w:val="single" w:color="C9D1DA" w:sz="4"/>
+              <w:bottom w:val="single" w:color="C9D1DA" w:sz="4"/>
+              <w:right w:val="single" w:color="C9D1DA" w:sz="4"/>
+            </w:tcBorders>
+            <w:shd w:fill="E6F4F7" w:color="auto" w:val="clear"/>
+            <w:tcMar>
+              <w:top w:type="dxa" w:w="90"/>
+              <w:left w:type="dxa" w:w="140"/>
+              <w:bottom w:type="dxa" w:w="90"/>
+              <w:right w:type="dxa" w:w="140"/>
+            </w:tcMar>
+            <w:vAlign w:val="center"/>
+          </w:tcPr>
+          <w:p>
+            <w:pPr>
+              <w:spacing w:after="40" w:line="252"/>
+              <w:jc w:val="left"/>
+            </w:pPr>
+            <w:r>
+              <w:rPr>
+                <w:b/>
+                <w:bCs/>
+                <w:color w:val="0B1F33"/>
+                <w:sz w:val="19"/>
+                <w:szCs w:val="19"/>
+              </w:rPr>
+              <w:t xml:space="preserve">Prioridad</w:t>
+            </w:r>
+          </w:p>
+        </w:tc>
+        <w:tc>
+          <w:tcPr>
+            <w:tcW w:type="dxa" w:w="7340"/>
+            <w:tcBorders>
+              <w:top w:val="single" w:color="C9D1DA" w:sz="4"/>
+              <w:left w:val="single" w:color="C9D1DA" w:sz="4"/>
+              <w:bottom w:val="single" w:color="C9D1DA" w:sz="4"/>
+              <w:right w:val="single" w:color="C9D1DA" w:sz="4"/>
+            </w:tcBorders>
+            <w:tcMar>
+              <w:top w:type="dxa" w:w="90"/>
+              <w:left w:type="dxa" w:w="140"/>
+              <w:bottom w:type="dxa" w:w="90"/>
+              <w:right w:type="dxa" w:w="140"/>
+            </w:tcMar>
+          </w:tcPr>
+          <w:p>
+            <w:pPr>
+              <w:spacing w:after="30" w:line="252"/>
+            </w:pPr>
+            <w:r>
+              <w:rPr>
+                <w:sz w:val="20"/>
+                <w:szCs w:val="20"/>
+              </w:rPr>
+              <w:t xml:space="preserve">Media</w:t>
+            </w:r>
+          </w:p>
+        </w:tc>
+      </w:tr>
+      <w:tr>
+        <w:trPr>
+          <w:cantSplit/>
+        </w:trPr>
+        <w:tc>
+          <w:tcPr>
+            <w:tcW w:type="dxa" w:w="2300"/>
+            <w:tcBorders>
+              <w:top w:val="single" w:color="C9D1DA" w:sz="4"/>
+              <w:left w:val="single" w:color="C9D1DA" w:sz="4"/>
+              <w:bottom w:val="single" w:color="C9D1DA" w:sz="4"/>
+              <w:right w:val="single" w:color="C9D1DA" w:sz="4"/>
+            </w:tcBorders>
+            <w:shd w:fill="E6F4F7" w:color="auto" w:val="clear"/>
+            <w:tcMar>
+              <w:top w:type="dxa" w:w="90"/>
+              <w:left w:type="dxa" w:w="140"/>
+              <w:bottom w:type="dxa" w:w="90"/>
+              <w:right w:type="dxa" w:w="140"/>
+            </w:tcMar>
+            <w:vAlign w:val="center"/>
+          </w:tcPr>
+          <w:p>
+            <w:pPr>
+              <w:spacing w:after="40" w:line="252"/>
+              <w:jc w:val="left"/>
+            </w:pPr>
+            <w:r>
+              <w:rPr>
+                <w:b/>
+                <w:bCs/>
+                <w:color w:val="0B1F33"/>
+                <w:sz w:val="19"/>
+                <w:szCs w:val="19"/>
+              </w:rPr>
+              <w:t xml:space="preserve">Descripción</w:t>
+            </w:r>
+          </w:p>
+        </w:tc>
+        <w:tc>
+          <w:tcPr>
+            <w:tcW w:type="dxa" w:w="7340"/>
+            <w:tcBorders>
+              <w:top w:val="single" w:color="C9D1DA" w:sz="4"/>
+              <w:left w:val="single" w:color="C9D1DA" w:sz="4"/>
+              <w:bottom w:val="single" w:color="C9D1DA" w:sz="4"/>
+              <w:right w:val="single" w:color="C9D1DA" w:sz="4"/>
+            </w:tcBorders>
+            <w:tcMar>
+              <w:top w:type="dxa" w:w="90"/>
+              <w:left w:type="dxa" w:w="140"/>
+              <w:bottom w:type="dxa" w:w="90"/>
+              <w:right w:type="dxa" w:w="140"/>
+            </w:tcMar>
+          </w:tcPr>
+          <w:p>
+            <w:pPr>
+              <w:spacing w:after="30" w:line="252"/>
+            </w:pPr>
+            <w:r>
+              <w:rPr>
+                <w:sz w:val="20"/>
+                <w:szCs w:val="20"/>
+              </w:rPr>
+              <w:t xml:space="preserve">En la pantalla «Explorar mapa», el aviso amarillo «Datos de ejemplo» y los botones de zoom y ubicación se dibujan encima de la franja de créditos de OpenStreetMap, por lo que el texto del copyright no se alcanza a leer.</w:t>
+            </w:r>
+          </w:p>
+        </w:tc>
+      </w:tr>
+      <w:tr>
+        <w:trPr>
+          <w:cantSplit/>
+        </w:trPr>
+        <w:tc>
+          <w:tcPr>
+            <w:tcW w:type="dxa" w:w="2300"/>
+            <w:tcBorders>
+              <w:top w:val="single" w:color="C9D1DA" w:sz="4"/>
+              <w:left w:val="single" w:color="C9D1DA" w:sz="4"/>
+              <w:bottom w:val="single" w:color="C9D1DA" w:sz="4"/>
+              <w:right w:val="single" w:color="C9D1DA" w:sz="4"/>
+            </w:tcBorders>
+            <w:shd w:fill="E6F4F7" w:color="auto" w:val="clear"/>
+            <w:tcMar>
+              <w:top w:type="dxa" w:w="90"/>
+              <w:left w:type="dxa" w:w="140"/>
+              <w:bottom w:type="dxa" w:w="90"/>
+              <w:right w:type="dxa" w:w="140"/>
+            </w:tcMar>
+            <w:vAlign w:val="center"/>
+          </w:tcPr>
+          <w:p>
+            <w:pPr>
+              <w:spacing w:after="40" w:line="252"/>
+              <w:jc w:val="left"/>
+            </w:pPr>
+            <w:r>
+              <w:rPr>
+                <w:b/>
+                <w:bCs/>
+                <w:color w:val="0B1F33"/>
+                <w:sz w:val="19"/>
+                <w:szCs w:val="19"/>
+              </w:rPr>
+              <w:t xml:space="preserve">Pasos para reproducir</w:t>
+            </w:r>
+          </w:p>
+        </w:tc>
+        <w:tc>
+          <w:tcPr>
+            <w:tcW w:type="dxa" w:w="7340"/>
+            <w:tcBorders>
+              <w:top w:val="single" w:color="C9D1DA" w:sz="4"/>
+              <w:left w:val="single" w:color="C9D1DA" w:sz="4"/>
+              <w:bottom w:val="single" w:color="C9D1DA" w:sz="4"/>
+              <w:right w:val="single" w:color="C9D1DA" w:sz="4"/>
+            </w:tcBorders>
+            <w:tcMar>
+              <w:top w:type="dxa" w:w="90"/>
+              <w:left w:type="dxa" w:w="140"/>
+              <w:bottom w:type="dxa" w:w="90"/>
+              <w:right w:type="dxa" w:w="140"/>
+            </w:tcMar>
+          </w:tcPr>
+          <w:p>
+            <w:pPr>
+              <w:spacing w:after="30" w:line="252"/>
+            </w:pPr>
+            <w:r>
+              <w:rPr>
+                <w:sz w:val="20"/>
+                <w:szCs w:val="20"/>
+              </w:rPr>
+              <w:t xml:space="preserve">1. Entrar como visitante a «Explorar mapa» en un teléfono.</w:t>
+            </w:r>
+          </w:p>
+          <w:p>
+            <w:pPr>
+              <w:spacing w:after="30" w:line="252"/>
+            </w:pPr>
+            <w:r>
+              <w:rPr>
+                <w:sz w:val="20"/>
+                <w:szCs w:val="20"/>
+              </w:rPr>
+              <w:t xml:space="preserve">2. Observar la parte inferior del mapa.</w:t>
+            </w:r>
+          </w:p>
+        </w:tc>
+      </w:tr>
+      <w:tr>
+        <w:trPr>
+          <w:cantSplit/>
+        </w:trPr>
+        <w:tc>
+          <w:tcPr>
+            <w:tcW w:type="dxa" w:w="2300"/>
+            <w:tcBorders>
+              <w:top w:val="single" w:color="C9D1DA" w:sz="4"/>
+              <w:left w:val="single" w:color="C9D1DA" w:sz="4"/>
+              <w:bottom w:val="single" w:color="C9D1DA" w:sz="4"/>
+              <w:right w:val="single" w:color="C9D1DA" w:sz="4"/>
+            </w:tcBorders>
+            <w:shd w:fill="E6F4F7" w:color="auto" w:val="clear"/>
+            <w:tcMar>
+              <w:top w:type="dxa" w:w="90"/>
+              <w:left w:type="dxa" w:w="140"/>
+              <w:bottom w:type="dxa" w:w="90"/>
+              <w:right w:type="dxa" w:w="140"/>
+            </w:tcMar>
+            <w:vAlign w:val="center"/>
+          </w:tcPr>
+          <w:p>
+            <w:pPr>
+              <w:spacing w:after="40" w:line="252"/>
+              <w:jc w:val="left"/>
+            </w:pPr>
+            <w:r>
+              <w:rPr>
+                <w:b/>
+                <w:bCs/>
+                <w:color w:val="0B1F33"/>
+                <w:sz w:val="19"/>
+                <w:szCs w:val="19"/>
+              </w:rPr>
+              <w:t xml:space="preserve">Resultado esperado</w:t>
+            </w:r>
+          </w:p>
+        </w:tc>
+        <w:tc>
+          <w:tcPr>
+            <w:tcW w:type="dxa" w:w="7340"/>
+            <w:tcBorders>
+              <w:top w:val="single" w:color="C9D1DA" w:sz="4"/>
+              <w:left w:val="single" w:color="C9D1DA" w:sz="4"/>
+              <w:bottom w:val="single" w:color="C9D1DA" w:sz="4"/>
+              <w:right w:val="single" w:color="C9D1DA" w:sz="4"/>
+            </w:tcBorders>
+            <w:tcMar>
+              <w:top w:type="dxa" w:w="90"/>
+              <w:left w:type="dxa" w:w="140"/>
+              <w:bottom w:type="dxa" w:w="90"/>
+              <w:right w:type="dxa" w:w="140"/>
+            </w:tcMar>
+          </w:tcPr>
+          <w:p>
+            <w:pPr>
+              <w:spacing w:after="30" w:line="252"/>
+            </w:pPr>
+            <w:r>
+              <w:rPr>
+                <w:sz w:val="20"/>
+                <w:szCs w:val="20"/>
+              </w:rPr>
+              <w:t xml:space="preserve">Los créditos del mapa deben leerse completos y los controles no deben tapar ningún texto.</w:t>
+            </w:r>
+          </w:p>
+        </w:tc>
+      </w:tr>
+      <w:tr>
+        <w:trPr>
+          <w:cantSplit/>
+        </w:trPr>
+        <w:tc>
+          <w:tcPr>
+            <w:tcW w:type="dxa" w:w="2300"/>
+            <w:tcBorders>
+              <w:top w:val="single" w:color="C9D1DA" w:sz="4"/>
+              <w:left w:val="single" w:color="C9D1DA" w:sz="4"/>
+              <w:bottom w:val="single" w:color="C9D1DA" w:sz="4"/>
+              <w:right w:val="single" w:color="C9D1DA" w:sz="4"/>
+            </w:tcBorders>
+            <w:shd w:fill="E6F4F7" w:color="auto" w:val="clear"/>
+            <w:tcMar>
+              <w:top w:type="dxa" w:w="90"/>
+              <w:left w:type="dxa" w:w="140"/>
+              <w:bottom w:type="dxa" w:w="90"/>
+              <w:right w:type="dxa" w:w="140"/>
+            </w:tcMar>
+            <w:vAlign w:val="center"/>
+          </w:tcPr>
+          <w:p>
+            <w:pPr>
+              <w:spacing w:after="40" w:line="252"/>
+              <w:jc w:val="left"/>
+            </w:pPr>
+            <w:r>
+              <w:rPr>
+                <w:b/>
+                <w:bCs/>
+                <w:color w:val="0B1F33"/>
+                <w:sz w:val="19"/>
+                <w:szCs w:val="19"/>
+              </w:rPr>
+              <w:t xml:space="preserve">Causa raíz</w:t>
+            </w:r>
+          </w:p>
+        </w:tc>
+        <w:tc>
+          <w:tcPr>
+            <w:tcW w:type="dxa" w:w="7340"/>
+            <w:tcBorders>
+              <w:top w:val="single" w:color="C9D1DA" w:sz="4"/>
+              <w:left w:val="single" w:color="C9D1DA" w:sz="4"/>
+              <w:bottom w:val="single" w:color="C9D1DA" w:sz="4"/>
+              <w:right w:val="single" w:color="C9D1DA" w:sz="4"/>
+            </w:tcBorders>
+            <w:tcMar>
+              <w:top w:type="dxa" w:w="90"/>
+              <w:left w:type="dxa" w:w="140"/>
+              <w:bottom w:type="dxa" w:w="90"/>
+              <w:right w:type="dxa" w:w="140"/>
+            </w:tcMar>
+          </w:tcPr>
+          <w:p>
+            <w:pPr>
+              <w:spacing w:after="30" w:line="252"/>
+            </w:pPr>
+            <w:r>
+              <w:rPr>
+                <w:sz w:val="20"/>
+                <w:szCs w:val="20"/>
+              </w:rPr>
+              <w:t xml:space="preserve">El aviso y los controles estaban colocados a 24 px del borde inferior, justo a la altura de la franja de créditos que dibuja el mapa.</w:t>
+            </w:r>
+          </w:p>
+        </w:tc>
+      </w:tr>
+      <w:tr>
+        <w:trPr>
+          <w:cantSplit/>
+        </w:trPr>
+        <w:tc>
+          <w:tcPr>
+            <w:tcW w:type="dxa" w:w="2300"/>
+            <w:tcBorders>
+              <w:top w:val="single" w:color="C9D1DA" w:sz="4"/>
+              <w:left w:val="single" w:color="C9D1DA" w:sz="4"/>
+              <w:bottom w:val="single" w:color="C9D1DA" w:sz="4"/>
+              <w:right w:val="single" w:color="C9D1DA" w:sz="4"/>
+            </w:tcBorders>
+            <w:shd w:fill="E6F4F7" w:color="auto" w:val="clear"/>
+            <w:tcMar>
+              <w:top w:type="dxa" w:w="90"/>
+              <w:left w:type="dxa" w:w="140"/>
+              <w:bottom w:type="dxa" w:w="90"/>
+              <w:right w:type="dxa" w:w="140"/>
+            </w:tcMar>
+            <w:vAlign w:val="center"/>
+          </w:tcPr>
+          <w:p>
+            <w:pPr>
+              <w:spacing w:after="40" w:line="252"/>
+              <w:jc w:val="left"/>
+            </w:pPr>
+            <w:r>
+              <w:rPr>
+                <w:b/>
+                <w:bCs/>
+                <w:color w:val="0B1F33"/>
+                <w:sz w:val="19"/>
+                <w:szCs w:val="19"/>
+              </w:rPr>
+              <w:t xml:space="preserve">Solución aplicada</w:t>
+            </w:r>
+          </w:p>
+        </w:tc>
+        <w:tc>
+          <w:tcPr>
+            <w:tcW w:type="dxa" w:w="7340"/>
+            <w:tcBorders>
+              <w:top w:val="single" w:color="C9D1DA" w:sz="4"/>
+              <w:left w:val="single" w:color="C9D1DA" w:sz="4"/>
+              <w:bottom w:val="single" w:color="C9D1DA" w:sz="4"/>
+              <w:right w:val="single" w:color="C9D1DA" w:sz="4"/>
+            </w:tcBorders>
+            <w:tcMar>
+              <w:top w:type="dxa" w:w="90"/>
+              <w:left w:type="dxa" w:w="140"/>
+              <w:bottom w:type="dxa" w:w="90"/>
+              <w:right w:type="dxa" w:w="140"/>
+            </w:tcMar>
+          </w:tcPr>
+          <w:p>
+            <w:pPr>
+              <w:pStyle w:val="ListParagraph"/>
+              <w:numPr>
+                <w:ilvl w:val="0"/>
+                <w:numId w:val="2"/>
+              </w:numPr>
+              <w:spacing w:after="30" w:line="252"/>
+            </w:pPr>
+            <w:r>
+              <w:rPr>
+                <w:sz w:val="20"/>
+                <w:szCs w:val="20"/>
+              </w:rPr>
+              <w:t xml:space="preserve">El aviso de datos de ejemplo y los controles del mapa se colocaron a 44 px del borde inferior (</w:t>
+            </w:r>
+            <w:r>
+              <w:rPr>
+                <w:rFonts w:ascii="Consolas" w:cs="Consolas" w:eastAsia="Consolas" w:hAnsi="Consolas"/>
+                <w:color w:val="1F3A5F"/>
+                <w:sz w:val="18"/>
+                <w:szCs w:val="18"/>
+              </w:rPr>
+              <w:t xml:space="preserve">_margenInferior</w:t>
+            </w:r>
+            <w:r>
+              <w:rPr>
+                <w:sz w:val="20"/>
+                <w:szCs w:val="20"/>
+              </w:rPr>
+              <w:t xml:space="preserve">), por encima de la franja de créditos.</w:t>
+            </w:r>
+          </w:p>
+        </w:tc>
+      </w:tr>
+      <w:tr>
+        <w:trPr>
+          <w:cantSplit/>
+        </w:trPr>
+        <w:tc>
+          <w:tcPr>
+            <w:tcW w:type="dxa" w:w="2300"/>
+            <w:tcBorders>
+              <w:top w:val="single" w:color="C9D1DA" w:sz="4"/>
+              <w:left w:val="single" w:color="C9D1DA" w:sz="4"/>
+              <w:bottom w:val="single" w:color="C9D1DA" w:sz="4"/>
+              <w:right w:val="single" w:color="C9D1DA" w:sz="4"/>
+            </w:tcBorders>
+            <w:shd w:fill="E6F4F7" w:color="auto" w:val="clear"/>
+            <w:tcMar>
+              <w:top w:type="dxa" w:w="90"/>
+              <w:left w:type="dxa" w:w="140"/>
+              <w:bottom w:type="dxa" w:w="90"/>
+              <w:right w:type="dxa" w:w="140"/>
+            </w:tcMar>
+            <w:vAlign w:val="center"/>
+          </w:tcPr>
+          <w:p>
+            <w:pPr>
+              <w:spacing w:after="40" w:line="252"/>
+              <w:jc w:val="left"/>
+            </w:pPr>
+            <w:r>
+              <w:rPr>
+                <w:b/>
+                <w:bCs/>
+                <w:color w:val="0B1F33"/>
+                <w:sz w:val="19"/>
+                <w:szCs w:val="19"/>
+              </w:rPr>
+              <w:t xml:space="preserve">Archivos modificados</w:t>
+            </w:r>
+          </w:p>
+        </w:tc>
+        <w:tc>
+          <w:tcPr>
+            <w:tcW w:type="dxa" w:w="7340"/>
+            <w:tcBorders>
+              <w:top w:val="single" w:color="C9D1DA" w:sz="4"/>
+              <w:left w:val="single" w:color="C9D1DA" w:sz="4"/>
+              <w:bottom w:val="single" w:color="C9D1DA" w:sz="4"/>
+              <w:right w:val="single" w:color="C9D1DA" w:sz="4"/>
+            </w:tcBorders>
+            <w:tcMar>
+              <w:top w:type="dxa" w:w="90"/>
+              <w:left w:type="dxa" w:w="140"/>
+              <w:bottom w:type="dxa" w:w="90"/>
+              <w:right w:type="dxa" w:w="140"/>
+            </w:tcMar>
+          </w:tcPr>
+          <w:p>
+            <w:pPr>
+              <w:pStyle w:val="ListParagraph"/>
+              <w:numPr>
+                <w:ilvl w:val="0"/>
+                <w:numId w:val="2"/>
+              </w:numPr>
+              <w:spacing w:after="30" w:line="252"/>
+            </w:pPr>
+            <w:r>
+              <w:rPr>
+                <w:rFonts w:ascii="Consolas" w:cs="Consolas" w:eastAsia="Consolas" w:hAnsi="Consolas"/>
+                <w:color w:val="1F3A5F"/>
+                <w:sz w:val="18"/>
+                <w:szCs w:val="18"/>
+              </w:rPr>
+              <w:t xml:space="preserve">lib/pages/explorar_mapa_page.dart</w:t>
+            </w:r>
+          </w:p>
+        </w:tc>
+      </w:tr>
+      <w:tr>
+        <w:trPr>
+          <w:cantSplit/>
+        </w:trPr>
+        <w:tc>
+          <w:tcPr>
+            <w:tcW w:type="dxa" w:w="2300"/>
+            <w:tcBorders>
+              <w:top w:val="single" w:color="C9D1DA" w:sz="4"/>
+              <w:left w:val="single" w:color="C9D1DA" w:sz="4"/>
+              <w:bottom w:val="single" w:color="C9D1DA" w:sz="4"/>
+              <w:right w:val="single" w:color="C9D1DA" w:sz="4"/>
+            </w:tcBorders>
+            <w:shd w:fill="E6F4F7" w:color="auto" w:val="clear"/>
+            <w:tcMar>
+              <w:top w:type="dxa" w:w="90"/>
+              <w:left w:type="dxa" w:w="140"/>
+              <w:bottom w:type="dxa" w:w="90"/>
+              <w:right w:type="dxa" w:w="140"/>
+            </w:tcMar>
+            <w:vAlign w:val="center"/>
+          </w:tcPr>
+          <w:p>
+            <w:pPr>
+              <w:spacing w:after="40" w:line="252"/>
+              <w:jc w:val="left"/>
+            </w:pPr>
+            <w:r>
+              <w:rPr>
+                <w:b/>
+                <w:bCs/>
+                <w:color w:val="0B1F33"/>
+                <w:sz w:val="19"/>
+                <w:szCs w:val="19"/>
+              </w:rPr>
+              <w:t xml:space="preserve">Verificación</w:t>
+            </w:r>
+          </w:p>
+        </w:tc>
+        <w:tc>
+          <w:tcPr>
+            <w:tcW w:type="dxa" w:w="7340"/>
+            <w:tcBorders>
+              <w:top w:val="single" w:color="C9D1DA" w:sz="4"/>
+              <w:left w:val="single" w:color="C9D1DA" w:sz="4"/>
+              <w:bottom w:val="single" w:color="C9D1DA" w:sz="4"/>
+              <w:right w:val="single" w:color="C9D1DA" w:sz="4"/>
+            </w:tcBorders>
+            <w:tcMar>
+              <w:top w:type="dxa" w:w="90"/>
+              <w:left w:type="dxa" w:w="140"/>
+              <w:bottom w:type="dxa" w:w="90"/>
+              <w:right w:type="dxa" w:w="140"/>
+            </w:tcMar>
+          </w:tcPr>
+          <w:p>
+            <w:pPr>
+              <w:spacing w:after="30" w:line="252"/>
+            </w:pPr>
+            <w:r>
+              <w:rPr>
+                <w:sz w:val="20"/>
+                <w:szCs w:val="20"/>
+              </w:rPr>
+              <w:t xml:space="preserve">Revisión de la distribución de la pantalla; </w:t>
+            </w:r>
+            <w:r>
+              <w:rPr>
+                <w:rFonts w:ascii="Consolas" w:cs="Consolas" w:eastAsia="Consolas" w:hAnsi="Consolas"/>
+                <w:color w:val="1F3A5F"/>
+                <w:sz w:val="18"/>
+                <w:szCs w:val="18"/>
+              </w:rPr>
+              <w:t xml:space="preserve">flutter analyze</w:t>
+            </w:r>
+            <w:r>
+              <w:rPr>
+                <w:sz w:val="20"/>
+                <w:szCs w:val="20"/>
+              </w:rPr>
+              <w:t xml:space="preserve"> sin observaciones. Pendiente de confirmar visualmente en un teléfono físico.</w:t>
+            </w:r>
+          </w:p>
+        </w:tc>
+      </w:tr>
+      <w:tr>
+        <w:trPr>
+          <w:cantSplit/>
+        </w:trPr>
+        <w:tc>
+          <w:tcPr>
+            <w:tcW w:type="dxa" w:w="2300"/>
+            <w:tcBorders>
+              <w:top w:val="single" w:color="C9D1DA" w:sz="4"/>
+              <w:left w:val="single" w:color="C9D1DA" w:sz="4"/>
+              <w:bottom w:val="single" w:color="C9D1DA" w:sz="4"/>
+              <w:right w:val="single" w:color="C9D1DA" w:sz="4"/>
+            </w:tcBorders>
+            <w:shd w:fill="E6F4F7" w:color="auto" w:val="clear"/>
+            <w:tcMar>
+              <w:top w:type="dxa" w:w="90"/>
+              <w:left w:type="dxa" w:w="140"/>
+              <w:bottom w:type="dxa" w:w="90"/>
+              <w:right w:type="dxa" w:w="140"/>
+            </w:tcMar>
+            <w:vAlign w:val="center"/>
+          </w:tcPr>
+          <w:p>
+            <w:pPr>
+              <w:spacing w:after="40" w:line="252"/>
+              <w:jc w:val="left"/>
+            </w:pPr>
+            <w:r>
+              <w:rPr>
+                <w:b/>
+                <w:bCs/>
+                <w:color w:val="0B1F33"/>
+                <w:sz w:val="19"/>
+                <w:szCs w:val="19"/>
+              </w:rPr>
+              <w:t xml:space="preserve">Estado</w:t>
+            </w:r>
+          </w:p>
+        </w:tc>
+        <w:tc>
+          <w:tcPr>
+            <w:tcW w:type="dxa" w:w="7340"/>
+            <w:tcBorders>
+              <w:top w:val="single" w:color="C9D1DA" w:sz="4"/>
+              <w:left w:val="single" w:color="C9D1DA" w:sz="4"/>
+              <w:bottom w:val="single" w:color="C9D1DA" w:sz="4"/>
+              <w:right w:val="single" w:color="C9D1DA" w:sz="4"/>
+            </w:tcBorders>
+            <w:tcMar>
+              <w:top w:type="dxa" w:w="90"/>
+              <w:left w:type="dxa" w:w="140"/>
+              <w:bottom w:type="dxa" w:w="90"/>
+              <w:right w:type="dxa" w:w="140"/>
+            </w:tcMar>
+          </w:tcPr>
+          <w:p>
+            <w:r>
+              <w:rPr>
+                <w:b/>
+                <w:bCs/>
+                <w:color w:val="B54708"/>
+                <w:sz w:val="20"/>
+                <w:szCs w:val="20"/>
+              </w:rPr>
+              <w:t xml:space="preserve">Corregido — pendiente de validación en dispositivo</w:t>
+            </w:r>
+          </w:p>
+        </w:tc>
+      </w:tr>
+    </w:tbl>
+    <w:p>
+      <w:pPr>
+        <w:pStyle w:val="Heading2"/>
+        <w:pageBreakBefore/>
+      </w:pPr>
+      <w:r>
+        <w:t xml:space="preserve">3.11 INC-10 — El logo nuevo (palmera) no carga en la app móvil</w:t>
+      </w:r>
+    </w:p>
+    <w:tbl>
+      <w:tblPr>
+        <w:tblW w:type="dxa" w:w="9640"/>
+        <w:tblBorders>
+          <w:top w:val="single" w:color="auto" w:sz="4"/>
+          <w:left w:val="single" w:color="auto" w:sz="4"/>
+          <w:bottom w:val="single" w:color="auto" w:sz="4"/>
+          <w:right w:val="single" w:color="auto" w:sz="4"/>
+          <w:insideH w:val="single" w:color="auto" w:sz="4"/>
+          <w:insideV w:val="single" w:color="auto" w:sz="4"/>
+        </w:tblBorders>
+      </w:tblPr>
+      <w:tblGrid>
+        <w:gridCol w:w="2300"/>
+        <w:gridCol w:w="7340"/>
+      </w:tblGrid>
+      <w:tr>
+        <w:trPr>
+          <w:cantSplit/>
+        </w:trPr>
+        <w:tc>
+          <w:tcPr>
+            <w:tcW w:type="dxa" w:w="2300"/>
+            <w:tcBorders>
+              <w:top w:val="single" w:color="C9D1DA" w:sz="4"/>
+              <w:left w:val="single" w:color="C9D1DA" w:sz="4"/>
+              <w:bottom w:val="single" w:color="C9D1DA" w:sz="4"/>
+              <w:right w:val="single" w:color="C9D1DA" w:sz="4"/>
+            </w:tcBorders>
+            <w:shd w:fill="E6F4F7" w:color="auto" w:val="clear"/>
+            <w:tcMar>
+              <w:top w:type="dxa" w:w="90"/>
+              <w:left w:type="dxa" w:w="140"/>
+              <w:bottom w:type="dxa" w:w="90"/>
+              <w:right w:type="dxa" w:w="140"/>
+            </w:tcMar>
+            <w:vAlign w:val="center"/>
+          </w:tcPr>
+          <w:p>
+            <w:pPr>
+              <w:spacing w:after="40" w:line="252"/>
+              <w:jc w:val="left"/>
+            </w:pPr>
+            <w:r>
+              <w:rPr>
+                <w:b/>
+                <w:bCs/>
+                <w:color w:val="0B1F33"/>
+                <w:sz w:val="19"/>
+                <w:szCs w:val="19"/>
+              </w:rPr>
+              <w:t xml:space="preserve">Referencia original</w:t>
+            </w:r>
+          </w:p>
+        </w:tc>
+        <w:tc>
+          <w:tcPr>
+            <w:tcW w:type="dxa" w:w="7340"/>
+            <w:tcBorders>
+              <w:top w:val="single" w:color="C9D1DA" w:sz="4"/>
+              <w:left w:val="single" w:color="C9D1DA" w:sz="4"/>
+              <w:bottom w:val="single" w:color="C9D1DA" w:sz="4"/>
+              <w:right w:val="single" w:color="C9D1DA" w:sz="4"/>
+            </w:tcBorders>
+            <w:tcMar>
+              <w:top w:type="dxa" w:w="90"/>
+              <w:left w:type="dxa" w:w="140"/>
+              <w:bottom w:type="dxa" w:w="90"/>
+              <w:right w:type="dxa" w:w="140"/>
+            </w:tcMar>
+          </w:tcPr>
+          <w:p>
+            <w:pPr>
+              <w:spacing w:after="30" w:line="252"/>
+            </w:pPr>
+            <w:r>
+              <w:rPr>
+                <w:sz w:val="20"/>
+                <w:szCs w:val="20"/>
+              </w:rPr>
+              <w:t xml:space="preserve">Reporte posterior (logo)</w:t>
+            </w:r>
+          </w:p>
+        </w:tc>
+      </w:tr>
+      <w:tr>
+        <w:trPr>
+          <w:cantSplit/>
+        </w:trPr>
+        <w:tc>
+          <w:tcPr>
+            <w:tcW w:type="dxa" w:w="2300"/>
+            <w:tcBorders>
+              <w:top w:val="single" w:color="C9D1DA" w:sz="4"/>
+              <w:left w:val="single" w:color="C9D1DA" w:sz="4"/>
+              <w:bottom w:val="single" w:color="C9D1DA" w:sz="4"/>
+              <w:right w:val="single" w:color="C9D1DA" w:sz="4"/>
+            </w:tcBorders>
+            <w:shd w:fill="E6F4F7" w:color="auto" w:val="clear"/>
+            <w:tcMar>
+              <w:top w:type="dxa" w:w="90"/>
+              <w:left w:type="dxa" w:w="140"/>
+              <w:bottom w:type="dxa" w:w="90"/>
+              <w:right w:type="dxa" w:w="140"/>
+            </w:tcMar>
+            <w:vAlign w:val="center"/>
+          </w:tcPr>
+          <w:p>
+            <w:pPr>
+              <w:spacing w:after="40" w:line="252"/>
+              <w:jc w:val="left"/>
+            </w:pPr>
+            <w:r>
+              <w:rPr>
+                <w:b/>
+                <w:bCs/>
+                <w:color w:val="0B1F33"/>
+                <w:sz w:val="19"/>
+                <w:szCs w:val="19"/>
+              </w:rPr>
+              <w:t xml:space="preserve">Módulo</w:t>
+            </w:r>
+          </w:p>
+        </w:tc>
+        <w:tc>
+          <w:tcPr>
+            <w:tcW w:type="dxa" w:w="7340"/>
+            <w:tcBorders>
+              <w:top w:val="single" w:color="C9D1DA" w:sz="4"/>
+              <w:left w:val="single" w:color="C9D1DA" w:sz="4"/>
+              <w:bottom w:val="single" w:color="C9D1DA" w:sz="4"/>
+              <w:right w:val="single" w:color="C9D1DA" w:sz="4"/>
+            </w:tcBorders>
+            <w:tcMar>
+              <w:top w:type="dxa" w:w="90"/>
+              <w:left w:type="dxa" w:w="140"/>
+              <w:bottom w:type="dxa" w:w="90"/>
+              <w:right w:type="dxa" w:w="140"/>
+            </w:tcMar>
+          </w:tcPr>
+          <w:p>
+            <w:pPr>
+              <w:spacing w:after="30" w:line="252"/>
+            </w:pPr>
+            <w:r>
+              <w:rPr>
+                <w:sz w:val="20"/>
+                <w:szCs w:val="20"/>
+              </w:rPr>
+              <w:t xml:space="preserve">Identidad visual (app móvil)</w:t>
+            </w:r>
+          </w:p>
+        </w:tc>
+      </w:tr>
+      <w:tr>
+        <w:trPr>
+          <w:cantSplit/>
+        </w:trPr>
+        <w:tc>
+          <w:tcPr>
+            <w:tcW w:type="dxa" w:w="2300"/>
+            <w:tcBorders>
+              <w:top w:val="single" w:color="C9D1DA" w:sz="4"/>
+              <w:left w:val="single" w:color="C9D1DA" w:sz="4"/>
+              <w:bottom w:val="single" w:color="C9D1DA" w:sz="4"/>
+              <w:right w:val="single" w:color="C9D1DA" w:sz="4"/>
+            </w:tcBorders>
+            <w:shd w:fill="E6F4F7" w:color="auto" w:val="clear"/>
+            <w:tcMar>
+              <w:top w:type="dxa" w:w="90"/>
+              <w:left w:type="dxa" w:w="140"/>
+              <w:bottom w:type="dxa" w:w="90"/>
+              <w:right w:type="dxa" w:w="140"/>
+            </w:tcMar>
+            <w:vAlign w:val="center"/>
+          </w:tcPr>
+          <w:p>
+            <w:pPr>
+              <w:spacing w:after="40" w:line="252"/>
+              <w:jc w:val="left"/>
+            </w:pPr>
+            <w:r>
+              <w:rPr>
+                <w:b/>
+                <w:bCs/>
+                <w:color w:val="0B1F33"/>
+                <w:sz w:val="19"/>
+                <w:szCs w:val="19"/>
+              </w:rPr>
+              <w:t xml:space="preserve">Prioridad</w:t>
+            </w:r>
+          </w:p>
+        </w:tc>
+        <w:tc>
+          <w:tcPr>
+            <w:tcW w:type="dxa" w:w="7340"/>
+            <w:tcBorders>
+              <w:top w:val="single" w:color="C9D1DA" w:sz="4"/>
+              <w:left w:val="single" w:color="C9D1DA" w:sz="4"/>
+              <w:bottom w:val="single" w:color="C9D1DA" w:sz="4"/>
+              <w:right w:val="single" w:color="C9D1DA" w:sz="4"/>
+            </w:tcBorders>
+            <w:tcMar>
+              <w:top w:type="dxa" w:w="90"/>
+              <w:left w:type="dxa" w:w="140"/>
+              <w:bottom w:type="dxa" w:w="90"/>
+              <w:right w:type="dxa" w:w="140"/>
+            </w:tcMar>
+          </w:tcPr>
+          <w:p>
+            <w:pPr>
+              <w:spacing w:after="30" w:line="252"/>
+            </w:pPr>
+            <w:r>
+              <w:rPr>
+                <w:sz w:val="20"/>
+                <w:szCs w:val="20"/>
+              </w:rPr>
+              <w:t xml:space="preserve">Media</w:t>
+            </w:r>
+          </w:p>
+        </w:tc>
+      </w:tr>
+      <w:tr>
+        <w:trPr>
+          <w:cantSplit/>
+        </w:trPr>
+        <w:tc>
+          <w:tcPr>
+            <w:tcW w:type="dxa" w:w="2300"/>
+            <w:tcBorders>
+              <w:top w:val="single" w:color="C9D1DA" w:sz="4"/>
+              <w:left w:val="single" w:color="C9D1DA" w:sz="4"/>
+              <w:bottom w:val="single" w:color="C9D1DA" w:sz="4"/>
+              <w:right w:val="single" w:color="C9D1DA" w:sz="4"/>
+            </w:tcBorders>
+            <w:shd w:fill="E6F4F7" w:color="auto" w:val="clear"/>
+            <w:tcMar>
+              <w:top w:type="dxa" w:w="90"/>
+              <w:left w:type="dxa" w:w="140"/>
+              <w:bottom w:type="dxa" w:w="90"/>
+              <w:right w:type="dxa" w:w="140"/>
+            </w:tcMar>
+            <w:vAlign w:val="center"/>
+          </w:tcPr>
+          <w:p>
+            <w:pPr>
+              <w:spacing w:after="40" w:line="252"/>
+              <w:jc w:val="left"/>
+            </w:pPr>
+            <w:r>
+              <w:rPr>
+                <w:b/>
+                <w:bCs/>
+                <w:color w:val="0B1F33"/>
+                <w:sz w:val="19"/>
+                <w:szCs w:val="19"/>
+              </w:rPr>
+              <w:t xml:space="preserve">Descripción</w:t>
+            </w:r>
+          </w:p>
+        </w:tc>
+        <w:tc>
+          <w:tcPr>
+            <w:tcW w:type="dxa" w:w="7340"/>
+            <w:tcBorders>
+              <w:top w:val="single" w:color="C9D1DA" w:sz="4"/>
+              <w:left w:val="single" w:color="C9D1DA" w:sz="4"/>
+              <w:bottom w:val="single" w:color="C9D1DA" w:sz="4"/>
+              <w:right w:val="single" w:color="C9D1DA" w:sz="4"/>
+            </w:tcBorders>
+            <w:tcMar>
+              <w:top w:type="dxa" w:w="90"/>
+              <w:left w:type="dxa" w:w="140"/>
+              <w:bottom w:type="dxa" w:w="90"/>
+              <w:right w:type="dxa" w:w="140"/>
+            </w:tcMar>
+          </w:tcPr>
+          <w:p>
+            <w:pPr>
+              <w:spacing w:after="30" w:line="252"/>
+            </w:pPr>
+            <w:r>
+              <w:rPr>
+                <w:sz w:val="20"/>
+                <w:szCs w:val="20"/>
+              </w:rPr>
+              <w:t xml:space="preserve">El nuevo logo de TouristMAR (palmera en círculo, con una versión para modo claro y otra para modo oscuro) se ve en el panel web, pero no aparece en la app móvil.</w:t>
+            </w:r>
+          </w:p>
+        </w:tc>
+      </w:tr>
+      <w:tr>
+        <w:trPr>
+          <w:cantSplit/>
+        </w:trPr>
+        <w:tc>
+          <w:tcPr>
+            <w:tcW w:type="dxa" w:w="2300"/>
+            <w:tcBorders>
+              <w:top w:val="single" w:color="C9D1DA" w:sz="4"/>
+              <w:left w:val="single" w:color="C9D1DA" w:sz="4"/>
+              <w:bottom w:val="single" w:color="C9D1DA" w:sz="4"/>
+              <w:right w:val="single" w:color="C9D1DA" w:sz="4"/>
+            </w:tcBorders>
+            <w:shd w:fill="E6F4F7" w:color="auto" w:val="clear"/>
+            <w:tcMar>
+              <w:top w:type="dxa" w:w="90"/>
+              <w:left w:type="dxa" w:w="140"/>
+              <w:bottom w:type="dxa" w:w="90"/>
+              <w:right w:type="dxa" w:w="140"/>
+            </w:tcMar>
+            <w:vAlign w:val="center"/>
+          </w:tcPr>
+          <w:p>
+            <w:pPr>
+              <w:spacing w:after="40" w:line="252"/>
+              <w:jc w:val="left"/>
+            </w:pPr>
+            <w:r>
+              <w:rPr>
+                <w:b/>
+                <w:bCs/>
+                <w:color w:val="0B1F33"/>
+                <w:sz w:val="19"/>
+                <w:szCs w:val="19"/>
+              </w:rPr>
+              <w:t xml:space="preserve">Pasos para reproducir</w:t>
+            </w:r>
+          </w:p>
+        </w:tc>
+        <w:tc>
+          <w:tcPr>
+            <w:tcW w:type="dxa" w:w="7340"/>
+            <w:tcBorders>
+              <w:top w:val="single" w:color="C9D1DA" w:sz="4"/>
+              <w:left w:val="single" w:color="C9D1DA" w:sz="4"/>
+              <w:bottom w:val="single" w:color="C9D1DA" w:sz="4"/>
+              <w:right w:val="single" w:color="C9D1DA" w:sz="4"/>
+            </w:tcBorders>
+            <w:tcMar>
+              <w:top w:type="dxa" w:w="90"/>
+              <w:left w:type="dxa" w:w="140"/>
+              <w:bottom w:type="dxa" w:w="90"/>
+              <w:right w:type="dxa" w:w="140"/>
+            </w:tcMar>
+          </w:tcPr>
+          <w:p>
+            <w:pPr>
+              <w:spacing w:after="30" w:line="252"/>
+            </w:pPr>
+            <w:r>
+              <w:rPr>
+                <w:sz w:val="20"/>
+                <w:szCs w:val="20"/>
+              </w:rPr>
+              <w:t xml:space="preserve">1. Abrir la app móvil en un teléfono.</w:t>
+            </w:r>
+          </w:p>
+          <w:p>
+            <w:pPr>
+              <w:spacing w:after="30" w:line="252"/>
+            </w:pPr>
+            <w:r>
+              <w:rPr>
+                <w:sz w:val="20"/>
+                <w:szCs w:val="20"/>
+              </w:rPr>
+              <w:t xml:space="preserve">2. Observar la barra superior o el menú lateral, donde debería aparecer el logo.</w:t>
+            </w:r>
+          </w:p>
+        </w:tc>
+      </w:tr>
+      <w:tr>
+        <w:trPr>
+          <w:cantSplit/>
+        </w:trPr>
+        <w:tc>
+          <w:tcPr>
+            <w:tcW w:type="dxa" w:w="2300"/>
+            <w:tcBorders>
+              <w:top w:val="single" w:color="C9D1DA" w:sz="4"/>
+              <w:left w:val="single" w:color="C9D1DA" w:sz="4"/>
+              <w:bottom w:val="single" w:color="C9D1DA" w:sz="4"/>
+              <w:right w:val="single" w:color="C9D1DA" w:sz="4"/>
+            </w:tcBorders>
+            <w:shd w:fill="E6F4F7" w:color="auto" w:val="clear"/>
+            <w:tcMar>
+              <w:top w:type="dxa" w:w="90"/>
+              <w:left w:type="dxa" w:w="140"/>
+              <w:bottom w:type="dxa" w:w="90"/>
+              <w:right w:type="dxa" w:w="140"/>
+            </w:tcMar>
+            <w:vAlign w:val="center"/>
+          </w:tcPr>
+          <w:p>
+            <w:pPr>
+              <w:spacing w:after="40" w:line="252"/>
+              <w:jc w:val="left"/>
+            </w:pPr>
+            <w:r>
+              <w:rPr>
+                <w:b/>
+                <w:bCs/>
+                <w:color w:val="0B1F33"/>
+                <w:sz w:val="19"/>
+                <w:szCs w:val="19"/>
+              </w:rPr>
+              <w:t xml:space="preserve">Resultado esperado</w:t>
+            </w:r>
+          </w:p>
+        </w:tc>
+        <w:tc>
+          <w:tcPr>
+            <w:tcW w:type="dxa" w:w="7340"/>
+            <w:tcBorders>
+              <w:top w:val="single" w:color="C9D1DA" w:sz="4"/>
+              <w:left w:val="single" w:color="C9D1DA" w:sz="4"/>
+              <w:bottom w:val="single" w:color="C9D1DA" w:sz="4"/>
+              <w:right w:val="single" w:color="C9D1DA" w:sz="4"/>
+            </w:tcBorders>
+            <w:tcMar>
+              <w:top w:type="dxa" w:w="90"/>
+              <w:left w:type="dxa" w:w="140"/>
+              <w:bottom w:type="dxa" w:w="90"/>
+              <w:right w:type="dxa" w:w="140"/>
+            </w:tcMar>
+          </w:tcPr>
+          <w:p>
+            <w:pPr>
+              <w:spacing w:after="30" w:line="252"/>
+            </w:pPr>
+            <w:r>
+              <w:rPr>
+                <w:sz w:val="20"/>
+                <w:szCs w:val="20"/>
+              </w:rPr>
+              <w:t xml:space="preserve">El logo debe mostrarse en la app móvil en ambos temas, igual que en el panel web.</w:t>
+            </w:r>
+          </w:p>
+        </w:tc>
+      </w:tr>
+      <w:tr>
+        <w:trPr>
+          <w:cantSplit/>
+        </w:trPr>
+        <w:tc>
+          <w:tcPr>
+            <w:tcW w:type="dxa" w:w="2300"/>
+            <w:tcBorders>
+              <w:top w:val="single" w:color="C9D1DA" w:sz="4"/>
+              <w:left w:val="single" w:color="C9D1DA" w:sz="4"/>
+              <w:bottom w:val="single" w:color="C9D1DA" w:sz="4"/>
+              <w:right w:val="single" w:color="C9D1DA" w:sz="4"/>
+            </w:tcBorders>
+            <w:shd w:fill="E6F4F7" w:color="auto" w:val="clear"/>
+            <w:tcMar>
+              <w:top w:type="dxa" w:w="90"/>
+              <w:left w:type="dxa" w:w="140"/>
+              <w:bottom w:type="dxa" w:w="90"/>
+              <w:right w:type="dxa" w:w="140"/>
+            </w:tcMar>
+            <w:vAlign w:val="center"/>
+          </w:tcPr>
+          <w:p>
+            <w:pPr>
+              <w:spacing w:after="40" w:line="252"/>
+              <w:jc w:val="left"/>
+            </w:pPr>
+            <w:r>
+              <w:rPr>
+                <w:b/>
+                <w:bCs/>
+                <w:color w:val="0B1F33"/>
+                <w:sz w:val="19"/>
+                <w:szCs w:val="19"/>
+              </w:rPr>
+              <w:t xml:space="preserve">Causa raíz</w:t>
+            </w:r>
+          </w:p>
+        </w:tc>
+        <w:tc>
+          <w:tcPr>
+            <w:tcW w:type="dxa" w:w="7340"/>
+            <w:tcBorders>
+              <w:top w:val="single" w:color="C9D1DA" w:sz="4"/>
+              <w:left w:val="single" w:color="C9D1DA" w:sz="4"/>
+              <w:bottom w:val="single" w:color="C9D1DA" w:sz="4"/>
+              <w:right w:val="single" w:color="C9D1DA" w:sz="4"/>
+            </w:tcBorders>
+            <w:tcMar>
+              <w:top w:type="dxa" w:w="90"/>
+              <w:left w:type="dxa" w:w="140"/>
+              <w:bottom w:type="dxa" w:w="90"/>
+              <w:right w:type="dxa" w:w="140"/>
+            </w:tcMar>
+          </w:tcPr>
+          <w:p>
+            <w:pPr>
+              <w:spacing w:after="30" w:line="252"/>
+            </w:pPr>
+            <w:r>
+              <w:rPr>
+                <w:sz w:val="20"/>
+                <w:szCs w:val="20"/>
+              </w:rPr>
+              <w:t xml:space="preserve">La app móvil reutiliza las pantallas del panel web, pero usa su propia copia de las imágenes (</w:t>
+            </w:r>
+            <w:r>
+              <w:rPr>
+                <w:rFonts w:ascii="Consolas" w:cs="Consolas" w:eastAsia="Consolas" w:hAnsi="Consolas"/>
+                <w:color w:val="1F3A5F"/>
+                <w:sz w:val="18"/>
+                <w:szCs w:val="18"/>
+              </w:rPr>
+              <w:t xml:space="preserve">apps/mobile/assets</w:t>
+            </w:r>
+            <w:r>
+              <w:rPr>
+                <w:sz w:val="20"/>
+                <w:szCs w:val="20"/>
+              </w:rPr>
+              <w:t xml:space="preserve">). Las imágenes </w:t>
+            </w:r>
+            <w:r>
+              <w:rPr>
+                <w:rFonts w:ascii="Consolas" w:cs="Consolas" w:eastAsia="Consolas" w:hAnsi="Consolas"/>
+                <w:color w:val="1F3A5F"/>
+                <w:sz w:val="18"/>
+                <w:szCs w:val="18"/>
+              </w:rPr>
+              <w:t xml:space="preserve">logo_light.png</w:t>
+            </w:r>
+            <w:r>
+              <w:rPr>
+                <w:sz w:val="20"/>
+                <w:szCs w:val="20"/>
+              </w:rPr>
+              <w:t xml:space="preserve"> y </w:t>
+            </w:r>
+            <w:r>
+              <w:rPr>
+                <w:rFonts w:ascii="Consolas" w:cs="Consolas" w:eastAsia="Consolas" w:hAnsi="Consolas"/>
+                <w:color w:val="1F3A5F"/>
+                <w:sz w:val="18"/>
+                <w:szCs w:val="18"/>
+              </w:rPr>
+              <w:t xml:space="preserve">logo_dark.png</w:t>
+            </w:r>
+            <w:r>
+              <w:rPr>
+                <w:sz w:val="20"/>
+                <w:szCs w:val="20"/>
+              </w:rPr>
+              <w:t xml:space="preserve"> se agregaron solo al panel web y no se copiaron ni se declararon en el </w:t>
+            </w:r>
+            <w:r>
+              <w:rPr>
+                <w:rFonts w:ascii="Consolas" w:cs="Consolas" w:eastAsia="Consolas" w:hAnsi="Consolas"/>
+                <w:color w:val="1F3A5F"/>
+                <w:sz w:val="18"/>
+                <w:szCs w:val="18"/>
+              </w:rPr>
+              <w:t xml:space="preserve">pubspec.yaml</w:t>
+            </w:r>
+            <w:r>
+              <w:rPr>
+                <w:sz w:val="20"/>
+                <w:szCs w:val="20"/>
+              </w:rPr>
+              <w:t xml:space="preserve"> de la app móvil.</w:t>
+            </w:r>
+          </w:p>
+        </w:tc>
+      </w:tr>
+      <w:tr>
+        <w:trPr>
+          <w:cantSplit/>
+        </w:trPr>
+        <w:tc>
+          <w:tcPr>
+            <w:tcW w:type="dxa" w:w="2300"/>
+            <w:tcBorders>
+              <w:top w:val="single" w:color="C9D1DA" w:sz="4"/>
+              <w:left w:val="single" w:color="C9D1DA" w:sz="4"/>
+              <w:bottom w:val="single" w:color="C9D1DA" w:sz="4"/>
+              <w:right w:val="single" w:color="C9D1DA" w:sz="4"/>
+            </w:tcBorders>
+            <w:shd w:fill="E6F4F7" w:color="auto" w:val="clear"/>
+            <w:tcMar>
+              <w:top w:type="dxa" w:w="90"/>
+              <w:left w:type="dxa" w:w="140"/>
+              <w:bottom w:type="dxa" w:w="90"/>
+              <w:right w:type="dxa" w:w="140"/>
+            </w:tcMar>
+            <w:vAlign w:val="center"/>
+          </w:tcPr>
+          <w:p>
+            <w:pPr>
+              <w:spacing w:after="40" w:line="252"/>
+              <w:jc w:val="left"/>
+            </w:pPr>
+            <w:r>
+              <w:rPr>
+                <w:b/>
+                <w:bCs/>
+                <w:color w:val="0B1F33"/>
+                <w:sz w:val="19"/>
+                <w:szCs w:val="19"/>
+              </w:rPr>
+              <w:t xml:space="preserve">Solución aplicada</w:t>
+            </w:r>
+          </w:p>
+        </w:tc>
+        <w:tc>
+          <w:tcPr>
+            <w:tcW w:type="dxa" w:w="7340"/>
+            <w:tcBorders>
+              <w:top w:val="single" w:color="C9D1DA" w:sz="4"/>
+              <w:left w:val="single" w:color="C9D1DA" w:sz="4"/>
+              <w:bottom w:val="single" w:color="C9D1DA" w:sz="4"/>
+              <w:right w:val="single" w:color="C9D1DA" w:sz="4"/>
+            </w:tcBorders>
+            <w:tcMar>
+              <w:top w:type="dxa" w:w="90"/>
+              <w:left w:type="dxa" w:w="140"/>
+              <w:bottom w:type="dxa" w:w="90"/>
+              <w:right w:type="dxa" w:w="140"/>
+            </w:tcMar>
+          </w:tcPr>
+          <w:p>
+            <w:pPr>
+              <w:pStyle w:val="ListParagraph"/>
+              <w:numPr>
+                <w:ilvl w:val="0"/>
+                <w:numId w:val="2"/>
+              </w:numPr>
+              <w:spacing w:after="30" w:line="252"/>
+            </w:pPr>
+            <w:r>
+              <w:rPr>
+                <w:sz w:val="20"/>
+                <w:szCs w:val="20"/>
+              </w:rPr>
+              <w:t xml:space="preserve">Se copiaron </w:t>
+            </w:r>
+            <w:r>
+              <w:rPr>
+                <w:rFonts w:ascii="Consolas" w:cs="Consolas" w:eastAsia="Consolas" w:hAnsi="Consolas"/>
+                <w:color w:val="1F3A5F"/>
+                <w:sz w:val="18"/>
+                <w:szCs w:val="18"/>
+              </w:rPr>
+              <w:t xml:space="preserve">logo_light.png</w:t>
+            </w:r>
+            <w:r>
+              <w:rPr>
+                <w:sz w:val="20"/>
+                <w:szCs w:val="20"/>
+              </w:rPr>
+              <w:t xml:space="preserve"> y </w:t>
+            </w:r>
+            <w:r>
+              <w:rPr>
+                <w:rFonts w:ascii="Consolas" w:cs="Consolas" w:eastAsia="Consolas" w:hAnsi="Consolas"/>
+                <w:color w:val="1F3A5F"/>
+                <w:sz w:val="18"/>
+                <w:szCs w:val="18"/>
+              </w:rPr>
+              <w:t xml:space="preserve">logo_dark.png</w:t>
+            </w:r>
+            <w:r>
+              <w:rPr>
+                <w:sz w:val="20"/>
+                <w:szCs w:val="20"/>
+              </w:rPr>
+              <w:t xml:space="preserve"> a </w:t>
+            </w:r>
+            <w:r>
+              <w:rPr>
+                <w:rFonts w:ascii="Consolas" w:cs="Consolas" w:eastAsia="Consolas" w:hAnsi="Consolas"/>
+                <w:color w:val="1F3A5F"/>
+                <w:sz w:val="18"/>
+                <w:szCs w:val="18"/>
+              </w:rPr>
+              <w:t xml:space="preserve">apps/mobile/assets/images/</w:t>
+            </w:r>
+            <w:r>
+              <w:rPr>
+                <w:sz w:val="20"/>
+                <w:szCs w:val="20"/>
+              </w:rPr>
+              <w:t xml:space="preserve">.</w:t>
+            </w:r>
+          </w:p>
+          <w:p>
+            <w:pPr>
+              <w:pStyle w:val="ListParagraph"/>
+              <w:numPr>
+                <w:ilvl w:val="0"/>
+                <w:numId w:val="2"/>
+              </w:numPr>
+              <w:spacing w:after="30" w:line="252"/>
+            </w:pPr>
+            <w:r>
+              <w:rPr>
+                <w:sz w:val="20"/>
+                <w:szCs w:val="20"/>
+              </w:rPr>
+              <w:t xml:space="preserve">Se declararon en la sección </w:t>
+            </w:r>
+            <w:r>
+              <w:rPr>
+                <w:rFonts w:ascii="Consolas" w:cs="Consolas" w:eastAsia="Consolas" w:hAnsi="Consolas"/>
+                <w:color w:val="1F3A5F"/>
+                <w:sz w:val="18"/>
+                <w:szCs w:val="18"/>
+              </w:rPr>
+              <w:t xml:space="preserve">assets</w:t>
+            </w:r>
+            <w:r>
+              <w:rPr>
+                <w:sz w:val="20"/>
+                <w:szCs w:val="20"/>
+              </w:rPr>
+              <w:t xml:space="preserve"> del </w:t>
+            </w:r>
+            <w:r>
+              <w:rPr>
+                <w:rFonts w:ascii="Consolas" w:cs="Consolas" w:eastAsia="Consolas" w:hAnsi="Consolas"/>
+                <w:color w:val="1F3A5F"/>
+                <w:sz w:val="18"/>
+                <w:szCs w:val="18"/>
+              </w:rPr>
+              <w:t xml:space="preserve">pubspec.yaml</w:t>
+            </w:r>
+            <w:r>
+              <w:rPr>
+                <w:sz w:val="20"/>
+                <w:szCs w:val="20"/>
+              </w:rPr>
+              <w:t xml:space="preserve"> de la app móvil, igual que en el panel web.</w:t>
+            </w:r>
+          </w:p>
+        </w:tc>
+      </w:tr>
+      <w:tr>
+        <w:trPr>
+          <w:cantSplit/>
+        </w:trPr>
+        <w:tc>
+          <w:tcPr>
+            <w:tcW w:type="dxa" w:w="2300"/>
+            <w:tcBorders>
+              <w:top w:val="single" w:color="C9D1DA" w:sz="4"/>
+              <w:left w:val="single" w:color="C9D1DA" w:sz="4"/>
+              <w:bottom w:val="single" w:color="C9D1DA" w:sz="4"/>
+              <w:right w:val="single" w:color="C9D1DA" w:sz="4"/>
+            </w:tcBorders>
+            <w:shd w:fill="E6F4F7" w:color="auto" w:val="clear"/>
+            <w:tcMar>
+              <w:top w:type="dxa" w:w="90"/>
+              <w:left w:type="dxa" w:w="140"/>
+              <w:bottom w:type="dxa" w:w="90"/>
+              <w:right w:type="dxa" w:w="140"/>
+            </w:tcMar>
+            <w:vAlign w:val="center"/>
+          </w:tcPr>
+          <w:p>
+            <w:pPr>
+              <w:spacing w:after="40" w:line="252"/>
+              <w:jc w:val="left"/>
+            </w:pPr>
+            <w:r>
+              <w:rPr>
+                <w:b/>
+                <w:bCs/>
+                <w:color w:val="0B1F33"/>
+                <w:sz w:val="19"/>
+                <w:szCs w:val="19"/>
+              </w:rPr>
+              <w:t xml:space="preserve">Archivos modificados</w:t>
+            </w:r>
+          </w:p>
+        </w:tc>
+        <w:tc>
+          <w:tcPr>
+            <w:tcW w:type="dxa" w:w="7340"/>
+            <w:tcBorders>
+              <w:top w:val="single" w:color="C9D1DA" w:sz="4"/>
+              <w:left w:val="single" w:color="C9D1DA" w:sz="4"/>
+              <w:bottom w:val="single" w:color="C9D1DA" w:sz="4"/>
+              <w:right w:val="single" w:color="C9D1DA" w:sz="4"/>
+            </w:tcBorders>
+            <w:tcMar>
+              <w:top w:type="dxa" w:w="90"/>
+              <w:left w:type="dxa" w:w="140"/>
+              <w:bottom w:type="dxa" w:w="90"/>
+              <w:right w:type="dxa" w:w="140"/>
+            </w:tcMar>
+          </w:tcPr>
+          <w:p>
+            <w:pPr>
+              <w:pStyle w:val="ListParagraph"/>
+              <w:numPr>
+                <w:ilvl w:val="0"/>
+                <w:numId w:val="2"/>
+              </w:numPr>
+              <w:spacing w:after="30" w:line="252"/>
+            </w:pPr>
+            <w:r>
+              <w:rPr>
+                <w:rFonts w:ascii="Consolas" w:cs="Consolas" w:eastAsia="Consolas" w:hAnsi="Consolas"/>
+                <w:color w:val="1F3A5F"/>
+                <w:sz w:val="18"/>
+                <w:szCs w:val="18"/>
+              </w:rPr>
+              <w:t xml:space="preserve">apps/mobile/pubspec.yaml</w:t>
+            </w:r>
+          </w:p>
+          <w:p>
+            <w:pPr>
+              <w:pStyle w:val="ListParagraph"/>
+              <w:numPr>
+                <w:ilvl w:val="0"/>
+                <w:numId w:val="2"/>
+              </w:numPr>
+              <w:spacing w:after="30" w:line="252"/>
+            </w:pPr>
+            <w:r>
+              <w:rPr>
+                <w:rFonts w:ascii="Consolas" w:cs="Consolas" w:eastAsia="Consolas" w:hAnsi="Consolas"/>
+                <w:color w:val="1F3A5F"/>
+                <w:sz w:val="18"/>
+                <w:szCs w:val="18"/>
+              </w:rPr>
+              <w:t xml:space="preserve">apps/mobile/assets/images/logo_light.png (nuevo)</w:t>
+            </w:r>
+          </w:p>
+          <w:p>
+            <w:pPr>
+              <w:pStyle w:val="ListParagraph"/>
+              <w:numPr>
+                <w:ilvl w:val="0"/>
+                <w:numId w:val="2"/>
+              </w:numPr>
+              <w:spacing w:after="30" w:line="252"/>
+            </w:pPr>
+            <w:r>
+              <w:rPr>
+                <w:rFonts w:ascii="Consolas" w:cs="Consolas" w:eastAsia="Consolas" w:hAnsi="Consolas"/>
+                <w:color w:val="1F3A5F"/>
+                <w:sz w:val="18"/>
+                <w:szCs w:val="18"/>
+              </w:rPr>
+              <w:t xml:space="preserve">apps/mobile/assets/images/logo_dark.png (nuevo)</w:t>
+            </w:r>
+          </w:p>
+        </w:tc>
+      </w:tr>
+      <w:tr>
+        <w:trPr>
+          <w:cantSplit/>
+        </w:trPr>
+        <w:tc>
+          <w:tcPr>
+            <w:tcW w:type="dxa" w:w="2300"/>
+            <w:tcBorders>
+              <w:top w:val="single" w:color="C9D1DA" w:sz="4"/>
+              <w:left w:val="single" w:color="C9D1DA" w:sz="4"/>
+              <w:bottom w:val="single" w:color="C9D1DA" w:sz="4"/>
+              <w:right w:val="single" w:color="C9D1DA" w:sz="4"/>
+            </w:tcBorders>
+            <w:shd w:fill="E6F4F7" w:color="auto" w:val="clear"/>
+            <w:tcMar>
+              <w:top w:type="dxa" w:w="90"/>
+              <w:left w:type="dxa" w:w="140"/>
+              <w:bottom w:type="dxa" w:w="90"/>
+              <w:right w:type="dxa" w:w="140"/>
+            </w:tcMar>
+            <w:vAlign w:val="center"/>
+          </w:tcPr>
+          <w:p>
+            <w:pPr>
+              <w:spacing w:after="40" w:line="252"/>
+              <w:jc w:val="left"/>
+            </w:pPr>
+            <w:r>
+              <w:rPr>
+                <w:b/>
+                <w:bCs/>
+                <w:color w:val="0B1F33"/>
+                <w:sz w:val="19"/>
+                <w:szCs w:val="19"/>
+              </w:rPr>
+              <w:t xml:space="preserve">Verificación</w:t>
+            </w:r>
+          </w:p>
+        </w:tc>
+        <w:tc>
+          <w:tcPr>
+            <w:tcW w:type="dxa" w:w="7340"/>
+            <w:tcBorders>
+              <w:top w:val="single" w:color="C9D1DA" w:sz="4"/>
+              <w:left w:val="single" w:color="C9D1DA" w:sz="4"/>
+              <w:bottom w:val="single" w:color="C9D1DA" w:sz="4"/>
+              <w:right w:val="single" w:color="C9D1DA" w:sz="4"/>
+            </w:tcBorders>
+            <w:tcMar>
+              <w:top w:type="dxa" w:w="90"/>
+              <w:left w:type="dxa" w:w="140"/>
+              <w:bottom w:type="dxa" w:w="90"/>
+              <w:right w:type="dxa" w:w="140"/>
+            </w:tcMar>
+          </w:tcPr>
+          <w:p>
+            <w:pPr>
+              <w:spacing w:after="30" w:line="252"/>
+            </w:pPr>
+            <w:r>
+              <w:rPr>
+                <w:sz w:val="20"/>
+                <w:szCs w:val="20"/>
+              </w:rPr>
+              <w:t xml:space="preserve">Se comparó la lista de imágenes declaradas en ambas apps: el logo era la única imagen faltante. Pendiente de confirmar visualmente en un teléfono físico.</w:t>
+            </w:r>
+          </w:p>
+        </w:tc>
+      </w:tr>
+      <w:tr>
+        <w:trPr>
+          <w:cantSplit/>
+        </w:trPr>
+        <w:tc>
+          <w:tcPr>
+            <w:tcW w:type="dxa" w:w="2300"/>
+            <w:tcBorders>
+              <w:top w:val="single" w:color="C9D1DA" w:sz="4"/>
+              <w:left w:val="single" w:color="C9D1DA" w:sz="4"/>
+              <w:bottom w:val="single" w:color="C9D1DA" w:sz="4"/>
+              <w:right w:val="single" w:color="C9D1DA" w:sz="4"/>
+            </w:tcBorders>
+            <w:shd w:fill="E6F4F7" w:color="auto" w:val="clear"/>
+            <w:tcMar>
+              <w:top w:type="dxa" w:w="90"/>
+              <w:left w:type="dxa" w:w="140"/>
+              <w:bottom w:type="dxa" w:w="90"/>
+              <w:right w:type="dxa" w:w="140"/>
+            </w:tcMar>
+            <w:vAlign w:val="center"/>
+          </w:tcPr>
+          <w:p>
+            <w:pPr>
+              <w:spacing w:after="40" w:line="252"/>
+              <w:jc w:val="left"/>
+            </w:pPr>
+            <w:r>
+              <w:rPr>
+                <w:b/>
+                <w:bCs/>
+                <w:color w:val="0B1F33"/>
+                <w:sz w:val="19"/>
+                <w:szCs w:val="19"/>
+              </w:rPr>
+              <w:t xml:space="preserve">Estado</w:t>
+            </w:r>
+          </w:p>
+        </w:tc>
+        <w:tc>
+          <w:tcPr>
+            <w:tcW w:type="dxa" w:w="7340"/>
+            <w:tcBorders>
+              <w:top w:val="single" w:color="C9D1DA" w:sz="4"/>
+              <w:left w:val="single" w:color="C9D1DA" w:sz="4"/>
+              <w:bottom w:val="single" w:color="C9D1DA" w:sz="4"/>
+              <w:right w:val="single" w:color="C9D1DA" w:sz="4"/>
+            </w:tcBorders>
+            <w:tcMar>
+              <w:top w:type="dxa" w:w="90"/>
+              <w:left w:type="dxa" w:w="140"/>
+              <w:bottom w:type="dxa" w:w="90"/>
+              <w:right w:type="dxa" w:w="140"/>
+            </w:tcMar>
+          </w:tcPr>
+          <w:p>
+            <w:r>
+              <w:rPr>
+                <w:b/>
+                <w:bCs/>
+                <w:color w:val="B54708"/>
+                <w:sz w:val="20"/>
+                <w:szCs w:val="20"/>
+              </w:rPr>
+              <w:t xml:space="preserve">Corregido — pendiente de validación en dispositivo</w:t>
             </w:r>
           </w:p>
         </w:tc>
@@ -11993,6 +14282,110 @@
           <w:b/>
           <w:bCs/>
         </w:rPr>
+        <w:t xml:space="preserve">Integración con la rama main.</w:t>
+      </w:r>
+      <w:r>
+        <w:t xml:space="preserve"> La rama </w:t>
+      </w:r>
+      <w:r>
+        <w:rPr>
+          <w:rFonts w:ascii="Consolas" w:cs="Consolas" w:eastAsia="Consolas" w:hAnsi="Consolas"/>
+          <w:color w:val="1F3A5F"/>
+          <w:sz w:val="19"/>
+          <w:szCs w:val="19"/>
+        </w:rPr>
+        <w:t xml:space="preserve">josue-fix</w:t>
+      </w:r>
+      <w:r>
+        <w:t xml:space="preserve"> se actualizó con los cambios recientes de </w:t>
+      </w:r>
+      <w:r>
+        <w:rPr>
+          <w:rFonts w:ascii="Consolas" w:cs="Consolas" w:eastAsia="Consolas" w:hAnsi="Consolas"/>
+          <w:color w:val="1F3A5F"/>
+          <w:sz w:val="19"/>
+          <w:szCs w:val="19"/>
+        </w:rPr>
+        <w:t xml:space="preserve">main</w:t>
+      </w:r>
+      <w:r>
+        <w:t xml:space="preserve"> (coordenadas de lugares, servicio </w:t>
+      </w:r>
+      <w:r>
+        <w:rPr>
+          <w:rFonts w:ascii="Consolas" w:cs="Consolas" w:eastAsia="Consolas" w:hAnsi="Consolas"/>
+          <w:color w:val="1F3A5F"/>
+          <w:sz w:val="19"/>
+          <w:szCs w:val="19"/>
+        </w:rPr>
+        <w:t xml:space="preserve">/api/lugares</w:t>
+      </w:r>
+      <w:r>
+        <w:t xml:space="preserve">, selector de RA). Los tres conflictos (</w:t>
+      </w:r>
+      <w:r>
+        <w:rPr>
+          <w:rFonts w:ascii="Consolas" w:cs="Consolas" w:eastAsia="Consolas" w:hAnsi="Consolas"/>
+          <w:color w:val="1F3A5F"/>
+          <w:sz w:val="19"/>
+          <w:szCs w:val="19"/>
+        </w:rPr>
+        <w:t xml:space="preserve">admin_ar_page.dart</w:t>
+      </w:r>
+      <w:r>
+        <w:t xml:space="preserve">, </w:t>
+      </w:r>
+      <w:r>
+        <w:rPr>
+          <w:rFonts w:ascii="Consolas" w:cs="Consolas" w:eastAsia="Consolas" w:hAnsi="Consolas"/>
+          <w:color w:val="1F3A5F"/>
+          <w:sz w:val="19"/>
+          <w:szCs w:val="19"/>
+        </w:rPr>
+        <w:t xml:space="preserve">admin_settings_page.dart</w:t>
+      </w:r>
+      <w:r>
+        <w:t xml:space="preserve"> y </w:t>
+      </w:r>
+      <w:r>
+        <w:rPr>
+          <w:rFonts w:ascii="Consolas" w:cs="Consolas" w:eastAsia="Consolas" w:hAnsi="Consolas"/>
+          <w:color w:val="1F3A5F"/>
+          <w:sz w:val="19"/>
+          <w:szCs w:val="19"/>
+        </w:rPr>
+        <w:t xml:space="preserve">ds_card.dart</w:t>
+      </w:r>
+      <w:r>
+        <w:t xml:space="preserve">) se resolvieron conservando lo decidido en </w:t>
+      </w:r>
+      <w:r>
+        <w:rPr>
+          <w:rFonts w:ascii="Consolas" w:cs="Consolas" w:eastAsia="Consolas" w:hAnsi="Consolas"/>
+          <w:color w:val="1F3A5F"/>
+          <w:sz w:val="19"/>
+          <w:szCs w:val="19"/>
+        </w:rPr>
+        <w:t xml:space="preserve">main</w:t>
+      </w:r>
+      <w:r>
+        <w:t xml:space="preserve"> y las actualizaciones de API de esta rama.</w:t>
+      </w:r>
+    </w:p>
+    <w:p>
+      <w:pPr>
+        <w:pStyle w:val="ListParagraph"/>
+        <w:numPr>
+          <w:ilvl w:val="0"/>
+          <w:numId w:val="2"/>
+        </w:numPr>
+        <w:spacing w:after="60" w:line="264"/>
+      </w:pPr>
+      <w:r>
+        <w:rPr>
+          <w:b/>
+          <w:bCs/>
+        </w:rPr>
         <w:t xml:space="preserve">Desbordamiento en el menú lateral de empresa.</w:t>
       </w:r>
       <w:r>
@@ -12509,7 +14902,7 @@
                 <w:sz w:val="20"/>
                 <w:szCs w:val="20"/>
               </w:rPr>
-              <w:t xml:space="preserve">—</w:t>
+              <w:t xml:space="preserve">Corrida antes de agregar el logo; ese cambio solo declara dos imágenes en el pubspec.</w:t>
             </w:r>
           </w:p>
         </w:tc>
@@ -12581,7 +14974,7 @@
                 <w:sz w:val="20"/>
                 <w:szCs w:val="20"/>
               </w:rPr>
-              <w:t xml:space="preserve">Aprobado: 36 de 36</w:t>
+              <w:t xml:space="preserve">Aprobado: 41 de 41</w:t>
             </w:r>
           </w:p>
         </w:tc>
@@ -12612,7 +15005,7 @@
                 <w:sz w:val="20"/>
                 <w:szCs w:val="20"/>
               </w:rPr>
-              <w:t xml:space="preserve">25 pruebas existentes y 11 pruebas nuevas de las incidencias.</w:t>
+              <w:t xml:space="preserve">Incluye las 11 pruebas nuevas de las incidencias y las pruebas integradas desde la rama main.</w:t>
             </w:r>
           </w:p>
         </w:tc>
@@ -13362,6 +15755,146 @@
           </w:p>
         </w:tc>
       </w:tr>
+      <w:tr>
+        <w:trPr>
+          <w:cantSplit/>
+        </w:trPr>
+        <w:tc>
+          <w:tcPr>
+            <w:tcW w:type="dxa" w:w="1300"/>
+            <w:tcBorders>
+              <w:top w:val="single" w:color="C9D1DA" w:sz="4"/>
+              <w:left w:val="single" w:color="C9D1DA" w:sz="4"/>
+              <w:bottom w:val="single" w:color="C9D1DA" w:sz="4"/>
+              <w:right w:val="single" w:color="C9D1DA" w:sz="4"/>
+            </w:tcBorders>
+            <w:shd w:fill="F3F5F7" w:color="auto" w:val="clear"/>
+            <w:tcMar>
+              <w:top w:type="dxa" w:w="90"/>
+              <w:left w:type="dxa" w:w="140"/>
+              <w:bottom w:type="dxa" w:w="90"/>
+              <w:right w:type="dxa" w:w="140"/>
+            </w:tcMar>
+            <w:vAlign w:val="center"/>
+          </w:tcPr>
+          <w:p>
+            <w:pPr>
+              <w:spacing w:after="40" w:line="252"/>
+              <w:jc w:val="left"/>
+            </w:pPr>
+            <w:r>
+              <w:rPr>
+                <w:b/>
+                <w:bCs/>
+                <w:sz w:val="20"/>
+                <w:szCs w:val="20"/>
+              </w:rPr>
+              <w:t xml:space="preserve">INC-09</w:t>
+            </w:r>
+          </w:p>
+        </w:tc>
+        <w:tc>
+          <w:tcPr>
+            <w:tcW w:type="dxa" w:w="8340"/>
+            <w:tcBorders>
+              <w:top w:val="single" w:color="C9D1DA" w:sz="4"/>
+              <w:left w:val="single" w:color="C9D1DA" w:sz="4"/>
+              <w:bottom w:val="single" w:color="C9D1DA" w:sz="4"/>
+              <w:right w:val="single" w:color="C9D1DA" w:sz="4"/>
+            </w:tcBorders>
+            <w:shd w:fill="F3F5F7" w:color="auto" w:val="clear"/>
+            <w:tcMar>
+              <w:top w:type="dxa" w:w="90"/>
+              <w:left w:type="dxa" w:w="140"/>
+              <w:bottom w:type="dxa" w:w="90"/>
+              <w:right w:type="dxa" w:w="140"/>
+            </w:tcMar>
+            <w:vAlign w:val="center"/>
+          </w:tcPr>
+          <w:p>
+            <w:pPr>
+              <w:spacing w:after="40" w:line="252"/>
+              <w:jc w:val="left"/>
+            </w:pPr>
+            <w:r>
+              <w:rPr>
+                <w:sz w:val="20"/>
+                <w:szCs w:val="20"/>
+              </w:rPr>
+              <w:t xml:space="preserve">Sin prueba automatizada: el mapa depende de mosaicos descargados de internet. Se verifica visualmente en el dispositivo.</w:t>
+            </w:r>
+          </w:p>
+        </w:tc>
+      </w:tr>
+      <w:tr>
+        <w:trPr>
+          <w:cantSplit/>
+        </w:trPr>
+        <w:tc>
+          <w:tcPr>
+            <w:tcW w:type="dxa" w:w="1300"/>
+            <w:tcBorders>
+              <w:top w:val="single" w:color="C9D1DA" w:sz="4"/>
+              <w:left w:val="single" w:color="C9D1DA" w:sz="4"/>
+              <w:bottom w:val="single" w:color="C9D1DA" w:sz="4"/>
+              <w:right w:val="single" w:color="C9D1DA" w:sz="4"/>
+            </w:tcBorders>
+            <w:tcMar>
+              <w:top w:type="dxa" w:w="90"/>
+              <w:left w:type="dxa" w:w="140"/>
+              <w:bottom w:type="dxa" w:w="90"/>
+              <w:right w:type="dxa" w:w="140"/>
+            </w:tcMar>
+            <w:vAlign w:val="center"/>
+          </w:tcPr>
+          <w:p>
+            <w:pPr>
+              <w:spacing w:after="40" w:line="252"/>
+              <w:jc w:val="left"/>
+            </w:pPr>
+            <w:r>
+              <w:rPr>
+                <w:b/>
+                <w:bCs/>
+                <w:sz w:val="20"/>
+                <w:szCs w:val="20"/>
+              </w:rPr>
+              <w:t xml:space="preserve">INC-10</w:t>
+            </w:r>
+          </w:p>
+        </w:tc>
+        <w:tc>
+          <w:tcPr>
+            <w:tcW w:type="dxa" w:w="8340"/>
+            <w:tcBorders>
+              <w:top w:val="single" w:color="C9D1DA" w:sz="4"/>
+              <w:left w:val="single" w:color="C9D1DA" w:sz="4"/>
+              <w:bottom w:val="single" w:color="C9D1DA" w:sz="4"/>
+              <w:right w:val="single" w:color="C9D1DA" w:sz="4"/>
+            </w:tcBorders>
+            <w:tcMar>
+              <w:top w:type="dxa" w:w="90"/>
+              <w:left w:type="dxa" w:w="140"/>
+              <w:bottom w:type="dxa" w:w="90"/>
+              <w:right w:type="dxa" w:w="140"/>
+            </w:tcMar>
+            <w:vAlign w:val="center"/>
+          </w:tcPr>
+          <w:p>
+            <w:pPr>
+              <w:spacing w:after="40" w:line="252"/>
+              <w:jc w:val="left"/>
+            </w:pPr>
+            <w:r>
+              <w:rPr>
+                <w:sz w:val="20"/>
+                <w:szCs w:val="20"/>
+              </w:rPr>
+              <w:t xml:space="preserve">Sin prueba automatizada: depende del empaquetado de la app móvil. Se verifica visualmente en el dispositivo.</w:t>
+            </w:r>
+          </w:p>
+        </w:tc>
+      </w:tr>
     </w:tbl>
     <w:p>
       <w:pPr>
@@ -13377,7 +15910,7 @@
         <w:jc w:val="both"/>
       </w:pPr>
       <w:r>
-        <w:t xml:space="preserve">Las pruebas automatizadas simulan el teclado, la barra de estado y la selección de imágenes. Se recomienda confirmar las incidencias INC-02 e INC-03 en un teléfono Android real, ya que dependen del teclado y la barra de estado de cada fabricante. Para ello se requiere:</w:t>
+        <w:t xml:space="preserve">Las pruebas automatizadas simulan el teclado, la barra de estado y la selección de imágenes. Se recomienda confirmar las incidencias INC-02 e INC-03 en un teléfono Android real, ya que dependen del teclado y la barra de estado de cada fabricante, así como INC-09 e INC-10, que no tienen prueba automatizada. Para ello se requiere:</w:t>
       </w:r>
     </w:p>
     <w:p>
@@ -13470,7 +16003,7 @@
         <w:jc w:val="both"/>
       </w:pPr>
       <w:r>
-        <w:t xml:space="preserve">Las nueve incidencias reportadas fueron corregidas en la rama josue-fix. Cada corrección cuenta con al menos una prueba automatizada que reproduce el escenario reportado y confirma el comportamiento esperado; las 36 pruebas del proyecto se aprobaron y el analizador estático de Flutter no reporta observaciones en la app web ni en la app móvil. Como siguiente paso se recomienda validar INC-02 e INC-03 en un teléfono Android físico y, una vez revisados los cambios por el equipo, integrar la rama a la rama principal.</w:t>
+        <w:t xml:space="preserve">Las once incidencias reportadas fueron corregidas en la rama josue-fix, que además se actualizó con los cambios más recientes de la rama main. Nueve de ellas cuentan con pruebas automatizadas que reproducen el escenario reportado; las 41 pruebas del proyecto se aprobaron y el analizador estático de Flutter no reporta observaciones. Como siguiente paso se recomienda instalar la app desde la rama en un teléfono Android físico para validar visualmente INC-02, INC-03, INC-09 e INC-10 y, una vez revisados los cambios por el equipo, integrar la rama a main.</w:t>
       </w:r>
     </w:p>
     <w:sectPr>

</xml_diff>